<commit_message>
Update One-Way ANOVA materials and HTML debrief content; adjust session duration and enhance score reporting
Co-authored-by: Copilot <copilot@github.com>
</commit_message>
<xml_diff>
--- a/classroom_activities/anova_part_a_student.docx
+++ b/classroom_activities/anova_part_a_student.docx
@@ -11,6 +11,7 @@
         <w:jc w:val="center"/>
         <w:rPr>
           <w:rFonts w:ascii="Garamond" w:hAnsi="Garamond"/>
+          <w:color w:val="000000" w:themeColor="text1"/>
         </w:rPr>
       </w:pPr>
       <w:r>
@@ -18,7 +19,7 @@
           <w:rFonts w:ascii="Garamond" w:hAnsi="Garamond"/>
           <w:b/>
           <w:bCs/>
-          <w:color w:val="154734"/>
+          <w:color w:val="000000" w:themeColor="text1"/>
           <w:sz w:val="36"/>
           <w:szCs w:val="36"/>
         </w:rPr>
@@ -30,7 +31,7 @@
           <w:rFonts w:ascii="Garamond" w:hAnsi="Garamond"/>
           <w:b/>
           <w:bCs/>
-          <w:color w:val="154734"/>
+          <w:color w:val="000000" w:themeColor="text1"/>
           <w:sz w:val="36"/>
           <w:szCs w:val="36"/>
         </w:rPr>
@@ -42,7 +43,7 @@
           <w:rFonts w:ascii="Garamond" w:hAnsi="Garamond"/>
           <w:b/>
           <w:bCs/>
-          <w:color w:val="154734"/>
+          <w:color w:val="000000" w:themeColor="text1"/>
           <w:sz w:val="36"/>
           <w:szCs w:val="36"/>
         </w:rPr>
@@ -54,6 +55,7 @@
         <w:spacing w:before="80" w:after="320"/>
         <w:rPr>
           <w:rFonts w:ascii="Garamond" w:hAnsi="Garamond"/>
+          <w:color w:val="000000" w:themeColor="text1"/>
         </w:rPr>
       </w:pPr>
       <w:r>
@@ -61,7 +63,7 @@
           <w:rFonts w:ascii="Garamond" w:hAnsi="Garamond"/>
           <w:b/>
           <w:bCs/>
-          <w:color w:val="888888"/>
+          <w:color w:val="000000" w:themeColor="text1"/>
           <w:sz w:val="20"/>
           <w:szCs w:val="20"/>
         </w:rPr>
@@ -73,30 +75,19 @@
           <w:rFonts w:ascii="Garamond" w:hAnsi="Garamond"/>
           <w:b/>
           <w:bCs/>
-          <w:color w:val="888888"/>
+          <w:color w:val="000000" w:themeColor="text1"/>
           <w:sz w:val="20"/>
           <w:szCs w:val="20"/>
         </w:rPr>
-        <w:t xml:space="preserve">ANOVA  </w:t>
-      </w:r>
+        <w:t>ANOVA  Student</w:t>
+      </w:r>
+      <w:proofErr w:type="gramEnd"/>
       <w:r>
         <w:rPr>
           <w:rFonts w:ascii="Garamond" w:hAnsi="Garamond"/>
           <w:b/>
           <w:bCs/>
-          <w:color w:val="154734"/>
-          <w:sz w:val="20"/>
-          <w:szCs w:val="20"/>
-        </w:rPr>
-        <w:t>Student</w:t>
-      </w:r>
-      <w:proofErr w:type="gramEnd"/>
-      <w:r>
-        <w:rPr>
-          <w:rFonts w:ascii="Garamond" w:hAnsi="Garamond"/>
-          <w:b/>
-          <w:bCs/>
-          <w:color w:val="154734"/>
+          <w:color w:val="000000" w:themeColor="text1"/>
           <w:sz w:val="20"/>
           <w:szCs w:val="20"/>
         </w:rPr>
@@ -125,12 +116,6 @@
         <w:gridCol w:w="4680"/>
       </w:tblGrid>
       <w:tr>
-        <w:tblPrEx>
-          <w:tblCellMar>
-            <w:top w:w="0" w:type="dxa"/>
-            <w:bottom w:w="0" w:type="dxa"/>
-          </w:tblCellMar>
-        </w:tblPrEx>
         <w:tc>
           <w:tcPr>
             <w:tcW w:w="4680" w:type="dxa"/>
@@ -152,6 +137,7 @@
               <w:spacing w:before="60" w:after="100"/>
               <w:rPr>
                 <w:rFonts w:ascii="Garamond" w:hAnsi="Garamond"/>
+                <w:color w:val="000000" w:themeColor="text1"/>
               </w:rPr>
             </w:pPr>
             <w:r>
@@ -159,13 +145,14 @@
                 <w:rFonts w:ascii="Garamond" w:hAnsi="Garamond"/>
                 <w:b/>
                 <w:bCs/>
+                <w:color w:val="000000" w:themeColor="text1"/>
               </w:rPr>
               <w:t xml:space="preserve">Name: </w:t>
             </w:r>
             <w:r>
               <w:rPr>
                 <w:rFonts w:ascii="Garamond" w:hAnsi="Garamond"/>
-                <w:color w:val="AAAAAA"/>
+                <w:color w:val="000000" w:themeColor="text1"/>
                 <w:u w:val="single"/>
               </w:rPr>
               <w:t>                                   </w:t>
@@ -193,6 +180,7 @@
               <w:spacing w:before="60" w:after="100"/>
               <w:rPr>
                 <w:rFonts w:ascii="Garamond" w:hAnsi="Garamond"/>
+                <w:color w:val="000000" w:themeColor="text1"/>
               </w:rPr>
             </w:pPr>
             <w:r>
@@ -200,12 +188,23 @@
                 <w:rFonts w:ascii="Garamond" w:hAnsi="Garamond"/>
                 <w:b/>
                 <w:bCs/>
+                <w:color w:val="000000" w:themeColor="text1"/>
+              </w:rPr>
+              <w:t xml:space="preserve">                                              </w:t>
+            </w:r>
+            <w:r>
+              <w:rPr>
+                <w:rFonts w:ascii="Garamond" w:hAnsi="Garamond"/>
+                <w:b/>
+                <w:bCs/>
+                <w:color w:val="000000" w:themeColor="text1"/>
               </w:rPr>
               <w:t xml:space="preserve">Date: </w:t>
             </w:r>
             <w:r>
               <w:rPr>
                 <w:rFonts w:ascii="Garamond" w:hAnsi="Garamond"/>
+                <w:color w:val="000000" w:themeColor="text1"/>
               </w:rPr>
               <w:t>April _____, 2026</w:t>
             </w:r>
@@ -218,6 +217,7 @@
         <w:spacing w:before="80" w:after="80"/>
         <w:rPr>
           <w:rFonts w:ascii="Garamond" w:hAnsi="Garamond"/>
+          <w:color w:val="000000" w:themeColor="text1"/>
         </w:rPr>
       </w:pPr>
     </w:p>
@@ -229,55 +229,31 @@
         <w:spacing w:before="200" w:after="200"/>
         <w:rPr>
           <w:rFonts w:ascii="Garamond" w:hAnsi="Garamond"/>
+          <w:color w:val="000000" w:themeColor="text1"/>
         </w:rPr>
       </w:pPr>
     </w:p>
     <w:tbl>
       <w:tblPr>
+        <w:tblStyle w:val="TableGrid"/>
         <w:tblW w:w="9360" w:type="dxa"/>
-        <w:tblBorders>
-          <w:top w:val="single" w:sz="4" w:space="0" w:color="auto"/>
-          <w:left w:val="single" w:sz="4" w:space="0" w:color="auto"/>
-          <w:bottom w:val="single" w:sz="4" w:space="0" w:color="auto"/>
-          <w:right w:val="single" w:sz="4" w:space="0" w:color="auto"/>
-          <w:insideH w:val="single" w:sz="4" w:space="0" w:color="auto"/>
-          <w:insideV w:val="single" w:sz="4" w:space="0" w:color="auto"/>
-        </w:tblBorders>
-        <w:tblCellMar>
-          <w:top w:w="100" w:type="dxa"/>
-          <w:left w:w="10" w:type="dxa"/>
-          <w:bottom w:w="100" w:type="dxa"/>
-          <w:right w:w="10" w:type="dxa"/>
-        </w:tblCellMar>
         <w:tblLook w:val="04A0" w:firstRow="1" w:lastRow="0" w:firstColumn="1" w:lastColumn="0" w:noHBand="0" w:noVBand="1"/>
       </w:tblPr>
       <w:tblGrid>
-        <w:gridCol w:w="180"/>
-        <w:gridCol w:w="9180"/>
+        <w:gridCol w:w="222"/>
+        <w:gridCol w:w="9138"/>
       </w:tblGrid>
       <w:tr>
         <w:tc>
           <w:tcPr>
             <w:tcW w:w="180" w:type="dxa"/>
-            <w:tcBorders>
-              <w:top w:val="none" w:sz="0" w:space="0" w:color="FFFFFF"/>
-              <w:left w:val="none" w:sz="0" w:space="0" w:color="FFFFFF"/>
-              <w:bottom w:val="none" w:sz="0" w:space="0" w:color="FFFFFF"/>
-              <w:right w:val="none" w:sz="0" w:space="0" w:color="FFFFFF"/>
-            </w:tcBorders>
-            <w:shd w:val="clear" w:color="auto" w:fill="154734"/>
-            <w:tcMar>
-              <w:top w:w="60" w:type="dxa"/>
-              <w:left w:w="0" w:type="dxa"/>
-              <w:bottom w:w="60" w:type="dxa"/>
-              <w:right w:w="0" w:type="dxa"/>
-            </w:tcMar>
           </w:tcPr>
           <w:p>
             <w:pPr>
               <w:spacing w:before="60" w:after="100"/>
               <w:rPr>
                 <w:rFonts w:ascii="Garamond" w:hAnsi="Garamond"/>
+                <w:color w:val="000000" w:themeColor="text1"/>
               </w:rPr>
             </w:pPr>
           </w:p>
@@ -285,25 +261,13 @@
         <w:tc>
           <w:tcPr>
             <w:tcW w:w="9180" w:type="dxa"/>
-            <w:tcBorders>
-              <w:top w:val="none" w:sz="0" w:space="0" w:color="FFFFFF"/>
-              <w:left w:val="none" w:sz="0" w:space="0" w:color="FFFFFF"/>
-              <w:bottom w:val="none" w:sz="0" w:space="0" w:color="FFFFFF"/>
-              <w:right w:val="none" w:sz="0" w:space="0" w:color="FFFFFF"/>
-            </w:tcBorders>
-            <w:shd w:val="clear" w:color="auto" w:fill="FAF8F2"/>
-            <w:tcMar>
-              <w:top w:w="100" w:type="dxa"/>
-              <w:left w:w="180" w:type="dxa"/>
-              <w:bottom w:w="100" w:type="dxa"/>
-              <w:right w:w="120" w:type="dxa"/>
-            </w:tcMar>
           </w:tcPr>
           <w:p>
             <w:pPr>
               <w:spacing w:before="40" w:after="40"/>
               <w:rPr>
                 <w:rFonts w:ascii="Garamond" w:hAnsi="Garamond"/>
+                <w:color w:val="000000" w:themeColor="text1"/>
               </w:rPr>
             </w:pPr>
             <w:r>
@@ -311,7 +275,7 @@
                 <w:rFonts w:ascii="Garamond" w:hAnsi="Garamond"/>
                 <w:b/>
                 <w:bCs/>
-                <w:color w:val="154734"/>
+                <w:color w:val="000000" w:themeColor="text1"/>
                 <w:sz w:val="20"/>
                 <w:szCs w:val="20"/>
               </w:rPr>
@@ -320,6 +284,7 @@
             <w:r>
               <w:rPr>
                 <w:rFonts w:ascii="Garamond" w:hAnsi="Garamond"/>
+                <w:color w:val="000000" w:themeColor="text1"/>
                 <w:sz w:val="20"/>
                 <w:szCs w:val="20"/>
               </w:rPr>
@@ -330,7 +295,7 @@
                 <w:rFonts w:ascii="Garamond" w:hAnsi="Garamond"/>
                 <w:b/>
                 <w:bCs/>
-                <w:color w:val="154734"/>
+                <w:color w:val="000000" w:themeColor="text1"/>
                 <w:sz w:val="20"/>
                 <w:szCs w:val="20"/>
               </w:rPr>
@@ -339,6 +304,7 @@
             <w:r>
               <w:rPr>
                 <w:rFonts w:ascii="Garamond" w:hAnsi="Garamond"/>
+                <w:color w:val="000000" w:themeColor="text1"/>
                 <w:sz w:val="20"/>
                 <w:szCs w:val="20"/>
               </w:rPr>
@@ -349,7 +315,7 @@
                 <w:rFonts w:ascii="Garamond" w:hAnsi="Garamond"/>
                 <w:b/>
                 <w:bCs/>
-                <w:color w:val="154734"/>
+                <w:color w:val="000000" w:themeColor="text1"/>
                 <w:sz w:val="20"/>
                 <w:szCs w:val="20"/>
               </w:rPr>
@@ -358,6 +324,7 @@
             <w:r>
               <w:rPr>
                 <w:rFonts w:ascii="Garamond" w:hAnsi="Garamond"/>
+                <w:color w:val="000000" w:themeColor="text1"/>
                 <w:sz w:val="20"/>
                 <w:szCs w:val="20"/>
               </w:rPr>
@@ -367,6 +334,7 @@
             <w:r>
               <w:rPr>
                 <w:rFonts w:ascii="Garamond" w:hAnsi="Garamond"/>
+                <w:color w:val="000000" w:themeColor="text1"/>
                 <w:sz w:val="20"/>
                 <w:szCs w:val="20"/>
               </w:rPr>
@@ -377,7 +345,7 @@
                 <w:rFonts w:ascii="Garamond" w:hAnsi="Garamond"/>
                 <w:b/>
                 <w:bCs/>
-                <w:color w:val="154734"/>
+                <w:color w:val="000000" w:themeColor="text1"/>
                 <w:sz w:val="20"/>
                 <w:szCs w:val="20"/>
               </w:rPr>
@@ -389,7 +357,7 @@
                 <w:rFonts w:ascii="Garamond" w:hAnsi="Garamond"/>
                 <w:b/>
                 <w:bCs/>
-                <w:color w:val="154734"/>
+                <w:color w:val="000000" w:themeColor="text1"/>
                 <w:sz w:val="20"/>
                 <w:szCs w:val="20"/>
               </w:rPr>
@@ -398,49 +366,30 @@
             <w:r>
               <w:rPr>
                 <w:rFonts w:ascii="Garamond" w:hAnsi="Garamond"/>
+                <w:color w:val="000000" w:themeColor="text1"/>
                 <w:sz w:val="20"/>
                 <w:szCs w:val="20"/>
               </w:rPr>
-              <w:t xml:space="preserve">active recall with </w:t>
-            </w:r>
-            <w:proofErr w:type="gramStart"/>
-            <w:r>
-              <w:rPr>
-                <w:rFonts w:ascii="Garamond" w:hAnsi="Garamond"/>
+              <w:t xml:space="preserve">active recall with flashcards, </w:t>
+            </w:r>
+            <w:r>
+              <w:rPr>
+                <w:rFonts w:ascii="Garamond" w:hAnsi="Garamond"/>
+                <w:b/>
+                <w:bCs/>
+                <w:color w:val="000000" w:themeColor="text1"/>
                 <w:sz w:val="20"/>
                 <w:szCs w:val="20"/>
               </w:rPr>
-              <w:t xml:space="preserve">flashcards,  </w:t>
-            </w:r>
-            <w:r>
-              <w:rPr>
-                <w:rFonts w:ascii="Garamond" w:hAnsi="Garamond"/>
-                <w:b/>
-                <w:bCs/>
-                <w:color w:val="154734"/>
+              <w:t xml:space="preserve">(C) </w:t>
+            </w:r>
+            <w:r>
+              <w:rPr>
+                <w:rFonts w:ascii="Garamond" w:hAnsi="Garamond"/>
+                <w:color w:val="000000" w:themeColor="text1"/>
                 <w:sz w:val="20"/>
                 <w:szCs w:val="20"/>
               </w:rPr>
-              <w:t>(</w:t>
-            </w:r>
-            <w:proofErr w:type="gramEnd"/>
-            <w:r>
-              <w:rPr>
-                <w:rFonts w:ascii="Garamond" w:hAnsi="Garamond"/>
-                <w:b/>
-                <w:bCs/>
-                <w:color w:val="154734"/>
-                <w:sz w:val="20"/>
-                <w:szCs w:val="20"/>
-              </w:rPr>
-              <w:t xml:space="preserve">C) </w:t>
-            </w:r>
-            <w:r>
-              <w:rPr>
-                <w:rFonts w:ascii="Garamond" w:hAnsi="Garamond"/>
-                <w:sz w:val="20"/>
-                <w:szCs w:val="20"/>
-              </w:rPr>
               <w:t>AI-assisted study with structured prompting. After the unit, all students take the same 100-point exam. The professor records each score and wants to determine whether differences in mean performance across groups could be explained by random variation alone, or whether there is real evidence of an effect.</w:t>
             </w:r>
           </w:p>
@@ -452,6 +401,7 @@
         <w:spacing w:before="200" w:after="200"/>
         <w:rPr>
           <w:rFonts w:ascii="Garamond" w:hAnsi="Garamond"/>
+          <w:color w:val="000000" w:themeColor="text1"/>
         </w:rPr>
       </w:pPr>
     </w:p>
@@ -463,6 +413,7 @@
         <w:spacing w:before="280" w:after="100"/>
         <w:rPr>
           <w:rFonts w:ascii="Garamond" w:hAnsi="Garamond"/>
+          <w:color w:val="000000" w:themeColor="text1"/>
         </w:rPr>
       </w:pPr>
       <w:r>
@@ -470,7 +421,7 @@
           <w:rFonts w:ascii="Garamond" w:hAnsi="Garamond"/>
           <w:b/>
           <w:bCs/>
-          <w:color w:val="154734"/>
+          <w:color w:val="000000" w:themeColor="text1"/>
           <w:sz w:val="26"/>
           <w:szCs w:val="26"/>
         </w:rPr>
@@ -482,17 +433,20 @@
         <w:spacing w:before="60" w:after="100"/>
         <w:rPr>
           <w:rFonts w:ascii="Garamond" w:hAnsi="Garamond"/>
-        </w:rPr>
-      </w:pPr>
-      <w:r>
-        <w:rPr>
-          <w:rFonts w:ascii="Garamond" w:hAnsi="Garamond"/>
+          <w:color w:val="000000" w:themeColor="text1"/>
+        </w:rPr>
+      </w:pPr>
+      <w:r>
+        <w:rPr>
+          <w:rFonts w:ascii="Garamond" w:hAnsi="Garamond"/>
+          <w:color w:val="000000" w:themeColor="text1"/>
         </w:rPr>
         <w:t>State the research question for this study in a complete sentence. Your question should identify what is being compared and for whom.</w:t>
       </w:r>
       <w:r>
         <w:rPr>
           <w:rFonts w:ascii="Garamond" w:hAnsi="Garamond"/>
+          <w:color w:val="000000" w:themeColor="text1"/>
         </w:rPr>
         <w:t xml:space="preserve"> Write the research question.</w:t>
       </w:r>
@@ -502,6 +456,7 @@
         <w:spacing w:before="200" w:after="200"/>
         <w:rPr>
           <w:rFonts w:ascii="Garamond" w:hAnsi="Garamond"/>
+          <w:color w:val="000000" w:themeColor="text1"/>
         </w:rPr>
       </w:pPr>
     </w:p>
@@ -510,6 +465,7 @@
         <w:spacing w:before="200" w:after="200"/>
         <w:rPr>
           <w:rFonts w:ascii="Garamond" w:hAnsi="Garamond"/>
+          <w:color w:val="000000" w:themeColor="text1"/>
         </w:rPr>
       </w:pPr>
     </w:p>
@@ -521,6 +477,7 @@
         <w:spacing w:before="200" w:after="200"/>
         <w:rPr>
           <w:rFonts w:ascii="Garamond" w:hAnsi="Garamond"/>
+          <w:color w:val="000000" w:themeColor="text1"/>
         </w:rPr>
       </w:pPr>
     </w:p>
@@ -532,6 +489,7 @@
         <w:spacing w:before="280" w:after="100"/>
         <w:rPr>
           <w:rFonts w:ascii="Garamond" w:hAnsi="Garamond"/>
+          <w:color w:val="000000" w:themeColor="text1"/>
         </w:rPr>
       </w:pPr>
       <w:r>
@@ -539,7 +497,7 @@
           <w:rFonts w:ascii="Garamond" w:hAnsi="Garamond"/>
           <w:b/>
           <w:bCs/>
-          <w:color w:val="154734"/>
+          <w:color w:val="000000" w:themeColor="text1"/>
           <w:sz w:val="26"/>
           <w:szCs w:val="26"/>
         </w:rPr>
@@ -551,6 +509,7 @@
         <w:spacing w:before="160" w:after="80"/>
         <w:rPr>
           <w:rFonts w:ascii="Garamond" w:hAnsi="Garamond"/>
+          <w:color w:val="000000" w:themeColor="text1"/>
         </w:rPr>
       </w:pPr>
       <w:r>
@@ -558,7 +517,7 @@
           <w:rFonts w:ascii="Garamond" w:hAnsi="Garamond"/>
           <w:b/>
           <w:bCs/>
-          <w:color w:val="154734"/>
+          <w:color w:val="000000" w:themeColor="text1"/>
         </w:rPr>
         <w:t>(a)  State the variables</w:t>
       </w:r>
@@ -568,30 +527,21 @@
         <w:spacing w:before="60" w:after="100"/>
         <w:rPr>
           <w:rFonts w:ascii="Garamond" w:hAnsi="Garamond"/>
-        </w:rPr>
-      </w:pPr>
-      <w:r>
-        <w:rPr>
-          <w:rFonts w:ascii="Garamond" w:hAnsi="Garamond"/>
+          <w:color w:val="000000" w:themeColor="text1"/>
+        </w:rPr>
+      </w:pPr>
+      <w:r>
+        <w:rPr>
+          <w:rFonts w:ascii="Garamond" w:hAnsi="Garamond"/>
+          <w:color w:val="000000" w:themeColor="text1"/>
         </w:rPr>
         <w:t>List each variable mentioned or implied in the scenario.</w:t>
       </w:r>
     </w:p>
     <w:tbl>
       <w:tblPr>
+        <w:tblStyle w:val="TableGrid"/>
         <w:tblW w:w="9360" w:type="dxa"/>
-        <w:tblBorders>
-          <w:top w:val="single" w:sz="4" w:space="0" w:color="auto"/>
-          <w:left w:val="single" w:sz="4" w:space="0" w:color="auto"/>
-          <w:bottom w:val="single" w:sz="4" w:space="0" w:color="auto"/>
-          <w:right w:val="single" w:sz="4" w:space="0" w:color="auto"/>
-          <w:insideH w:val="single" w:sz="4" w:space="0" w:color="auto"/>
-          <w:insideV w:val="single" w:sz="4" w:space="0" w:color="auto"/>
-        </w:tblBorders>
-        <w:tblCellMar>
-          <w:left w:w="10" w:type="dxa"/>
-          <w:right w:w="10" w:type="dxa"/>
-        </w:tblCellMar>
         <w:tblLook w:val="04A0" w:firstRow="1" w:lastRow="0" w:firstColumn="1" w:lastColumn="0" w:noHBand="0" w:noVBand="1"/>
       </w:tblPr>
       <w:tblGrid>
@@ -599,37 +549,16 @@
         <w:gridCol w:w="6160"/>
       </w:tblGrid>
       <w:tr>
-        <w:tblPrEx>
-          <w:tblCellMar>
-            <w:top w:w="0" w:type="dxa"/>
-            <w:bottom w:w="0" w:type="dxa"/>
-          </w:tblCellMar>
-        </w:tblPrEx>
-        <w:trPr>
-          <w:tblHeader/>
-        </w:trPr>
         <w:tc>
           <w:tcPr>
             <w:tcW w:w="3200" w:type="dxa"/>
-            <w:tcBorders>
-              <w:top w:val="single" w:sz="4" w:space="0" w:color="DDD8CC"/>
-              <w:left w:val="single" w:sz="4" w:space="0" w:color="DDD8CC"/>
-              <w:bottom w:val="single" w:sz="4" w:space="0" w:color="DDD8CC"/>
-              <w:right w:val="single" w:sz="4" w:space="0" w:color="DDD8CC"/>
-            </w:tcBorders>
-            <w:shd w:val="clear" w:color="auto" w:fill="EDF7F2"/>
-            <w:tcMar>
-              <w:top w:w="80" w:type="dxa"/>
-              <w:left w:w="120" w:type="dxa"/>
-              <w:bottom w:w="80" w:type="dxa"/>
-              <w:right w:w="120" w:type="dxa"/>
-            </w:tcMar>
           </w:tcPr>
           <w:p>
             <w:pPr>
               <w:spacing w:before="60" w:after="100"/>
               <w:rPr>
                 <w:rFonts w:ascii="Garamond" w:hAnsi="Garamond"/>
+                <w:color w:val="000000" w:themeColor="text1"/>
               </w:rPr>
             </w:pPr>
             <w:r>
@@ -637,6 +566,7 @@
                 <w:rFonts w:ascii="Garamond" w:hAnsi="Garamond"/>
                 <w:b/>
                 <w:bCs/>
+                <w:color w:val="000000" w:themeColor="text1"/>
               </w:rPr>
               <w:t>Variable Name</w:t>
             </w:r>
@@ -645,25 +575,13 @@
         <w:tc>
           <w:tcPr>
             <w:tcW w:w="6160" w:type="dxa"/>
-            <w:tcBorders>
-              <w:top w:val="single" w:sz="4" w:space="0" w:color="DDD8CC"/>
-              <w:left w:val="single" w:sz="4" w:space="0" w:color="DDD8CC"/>
-              <w:bottom w:val="single" w:sz="4" w:space="0" w:color="DDD8CC"/>
-              <w:right w:val="single" w:sz="4" w:space="0" w:color="DDD8CC"/>
-            </w:tcBorders>
-            <w:shd w:val="clear" w:color="auto" w:fill="EDF7F2"/>
-            <w:tcMar>
-              <w:top w:w="80" w:type="dxa"/>
-              <w:left w:w="120" w:type="dxa"/>
-              <w:bottom w:w="80" w:type="dxa"/>
-              <w:right w:w="120" w:type="dxa"/>
-            </w:tcMar>
           </w:tcPr>
           <w:p>
             <w:pPr>
               <w:spacing w:before="60" w:after="100"/>
               <w:rPr>
                 <w:rFonts w:ascii="Garamond" w:hAnsi="Garamond"/>
+                <w:color w:val="000000" w:themeColor="text1"/>
               </w:rPr>
             </w:pPr>
             <w:r>
@@ -671,6 +589,7 @@
                 <w:rFonts w:ascii="Garamond" w:hAnsi="Garamond"/>
                 <w:b/>
                 <w:bCs/>
+                <w:color w:val="000000" w:themeColor="text1"/>
               </w:rPr>
               <w:t>Description</w:t>
             </w:r>
@@ -678,39 +597,22 @@
         </w:tc>
       </w:tr>
       <w:tr>
-        <w:tblPrEx>
-          <w:tblCellMar>
-            <w:top w:w="0" w:type="dxa"/>
-            <w:bottom w:w="0" w:type="dxa"/>
-          </w:tblCellMar>
-        </w:tblPrEx>
         <w:tc>
           <w:tcPr>
             <w:tcW w:w="3200" w:type="dxa"/>
-            <w:tcBorders>
-              <w:top w:val="single" w:sz="4" w:space="0" w:color="DDD8CC"/>
-              <w:left w:val="single" w:sz="4" w:space="0" w:color="DDD8CC"/>
-              <w:bottom w:val="single" w:sz="4" w:space="0" w:color="DDD8CC"/>
-              <w:right w:val="single" w:sz="4" w:space="0" w:color="DDD8CC"/>
-            </w:tcBorders>
-            <w:tcMar>
-              <w:top w:w="80" w:type="dxa"/>
-              <w:left w:w="120" w:type="dxa"/>
-              <w:bottom w:w="80" w:type="dxa"/>
-              <w:right w:w="120" w:type="dxa"/>
-            </w:tcMar>
           </w:tcPr>
           <w:p>
             <w:pPr>
               <w:spacing w:before="60" w:after="100"/>
               <w:rPr>
                 <w:rFonts w:ascii="Garamond" w:hAnsi="Garamond"/>
-              </w:rPr>
-            </w:pPr>
-            <w:r>
-              <w:rPr>
-                <w:rFonts w:ascii="Garamond" w:hAnsi="Garamond"/>
-                <w:color w:val="AAAAAA"/>
+                <w:color w:val="000000" w:themeColor="text1"/>
+              </w:rPr>
+            </w:pPr>
+            <w:r>
+              <w:rPr>
+                <w:rFonts w:ascii="Garamond" w:hAnsi="Garamond"/>
+                <w:color w:val="000000" w:themeColor="text1"/>
                 <w:u w:val="single"/>
               </w:rPr>
               <w:t>                      </w:t>
@@ -720,30 +622,19 @@
         <w:tc>
           <w:tcPr>
             <w:tcW w:w="6160" w:type="dxa"/>
-            <w:tcBorders>
-              <w:top w:val="single" w:sz="4" w:space="0" w:color="DDD8CC"/>
-              <w:left w:val="single" w:sz="4" w:space="0" w:color="DDD8CC"/>
-              <w:bottom w:val="single" w:sz="4" w:space="0" w:color="DDD8CC"/>
-              <w:right w:val="single" w:sz="4" w:space="0" w:color="DDD8CC"/>
-            </w:tcBorders>
-            <w:tcMar>
-              <w:top w:w="80" w:type="dxa"/>
-              <w:left w:w="120" w:type="dxa"/>
-              <w:bottom w:w="80" w:type="dxa"/>
-              <w:right w:w="120" w:type="dxa"/>
-            </w:tcMar>
           </w:tcPr>
           <w:p>
             <w:pPr>
               <w:spacing w:before="60" w:after="100"/>
               <w:rPr>
                 <w:rFonts w:ascii="Garamond" w:hAnsi="Garamond"/>
-              </w:rPr>
-            </w:pPr>
-            <w:r>
-              <w:rPr>
-                <w:rFonts w:ascii="Garamond" w:hAnsi="Garamond"/>
-                <w:color w:val="AAAAAA"/>
+                <w:color w:val="000000" w:themeColor="text1"/>
+              </w:rPr>
+            </w:pPr>
+            <w:r>
+              <w:rPr>
+                <w:rFonts w:ascii="Garamond" w:hAnsi="Garamond"/>
+                <w:color w:val="000000" w:themeColor="text1"/>
                 <w:u w:val="single"/>
               </w:rPr>
               <w:t>                                                  </w:t>
@@ -752,39 +643,22 @@
         </w:tc>
       </w:tr>
       <w:tr>
-        <w:tblPrEx>
-          <w:tblCellMar>
-            <w:top w:w="0" w:type="dxa"/>
-            <w:bottom w:w="0" w:type="dxa"/>
-          </w:tblCellMar>
-        </w:tblPrEx>
         <w:tc>
           <w:tcPr>
             <w:tcW w:w="3200" w:type="dxa"/>
-            <w:tcBorders>
-              <w:top w:val="single" w:sz="4" w:space="0" w:color="DDD8CC"/>
-              <w:left w:val="single" w:sz="4" w:space="0" w:color="DDD8CC"/>
-              <w:bottom w:val="single" w:sz="4" w:space="0" w:color="DDD8CC"/>
-              <w:right w:val="single" w:sz="4" w:space="0" w:color="DDD8CC"/>
-            </w:tcBorders>
-            <w:tcMar>
-              <w:top w:w="80" w:type="dxa"/>
-              <w:left w:w="120" w:type="dxa"/>
-              <w:bottom w:w="80" w:type="dxa"/>
-              <w:right w:w="120" w:type="dxa"/>
-            </w:tcMar>
           </w:tcPr>
           <w:p>
             <w:pPr>
               <w:spacing w:before="60" w:after="100"/>
               <w:rPr>
                 <w:rFonts w:ascii="Garamond" w:hAnsi="Garamond"/>
-              </w:rPr>
-            </w:pPr>
-            <w:r>
-              <w:rPr>
-                <w:rFonts w:ascii="Garamond" w:hAnsi="Garamond"/>
-                <w:color w:val="AAAAAA"/>
+                <w:color w:val="000000" w:themeColor="text1"/>
+              </w:rPr>
+            </w:pPr>
+            <w:r>
+              <w:rPr>
+                <w:rFonts w:ascii="Garamond" w:hAnsi="Garamond"/>
+                <w:color w:val="000000" w:themeColor="text1"/>
                 <w:u w:val="single"/>
               </w:rPr>
               <w:t>                      </w:t>
@@ -794,30 +668,19 @@
         <w:tc>
           <w:tcPr>
             <w:tcW w:w="6160" w:type="dxa"/>
-            <w:tcBorders>
-              <w:top w:val="single" w:sz="4" w:space="0" w:color="DDD8CC"/>
-              <w:left w:val="single" w:sz="4" w:space="0" w:color="DDD8CC"/>
-              <w:bottom w:val="single" w:sz="4" w:space="0" w:color="DDD8CC"/>
-              <w:right w:val="single" w:sz="4" w:space="0" w:color="DDD8CC"/>
-            </w:tcBorders>
-            <w:tcMar>
-              <w:top w:w="80" w:type="dxa"/>
-              <w:left w:w="120" w:type="dxa"/>
-              <w:bottom w:w="80" w:type="dxa"/>
-              <w:right w:w="120" w:type="dxa"/>
-            </w:tcMar>
           </w:tcPr>
           <w:p>
             <w:pPr>
               <w:spacing w:before="60" w:after="100"/>
               <w:rPr>
                 <w:rFonts w:ascii="Garamond" w:hAnsi="Garamond"/>
-              </w:rPr>
-            </w:pPr>
-            <w:r>
-              <w:rPr>
-                <w:rFonts w:ascii="Garamond" w:hAnsi="Garamond"/>
-                <w:color w:val="AAAAAA"/>
+                <w:color w:val="000000" w:themeColor="text1"/>
+              </w:rPr>
+            </w:pPr>
+            <w:r>
+              <w:rPr>
+                <w:rFonts w:ascii="Garamond" w:hAnsi="Garamond"/>
+                <w:color w:val="000000" w:themeColor="text1"/>
                 <w:u w:val="single"/>
               </w:rPr>
               <w:t>                                                  </w:t>
@@ -831,6 +694,7 @@
         <w:spacing w:before="240" w:after="240"/>
         <w:rPr>
           <w:rFonts w:ascii="Garamond" w:hAnsi="Garamond"/>
+          <w:color w:val="000000" w:themeColor="text1"/>
         </w:rPr>
       </w:pPr>
     </w:p>
@@ -839,6 +703,7 @@
         <w:spacing w:before="160" w:after="80"/>
         <w:rPr>
           <w:rFonts w:ascii="Garamond" w:hAnsi="Garamond"/>
+          <w:color w:val="000000" w:themeColor="text1"/>
         </w:rPr>
       </w:pPr>
       <w:r>
@@ -846,26 +711,15 @@
           <w:rFonts w:ascii="Garamond" w:hAnsi="Garamond"/>
           <w:b/>
           <w:bCs/>
-          <w:color w:val="154734"/>
+          <w:color w:val="000000" w:themeColor="text1"/>
         </w:rPr>
         <w:t>(b)  Identify the Explanatory and Response Variables</w:t>
       </w:r>
     </w:p>
     <w:tbl>
       <w:tblPr>
+        <w:tblStyle w:val="TableGrid"/>
         <w:tblW w:w="9360" w:type="dxa"/>
-        <w:tblBorders>
-          <w:top w:val="single" w:sz="4" w:space="0" w:color="auto"/>
-          <w:left w:val="single" w:sz="4" w:space="0" w:color="auto"/>
-          <w:bottom w:val="single" w:sz="4" w:space="0" w:color="auto"/>
-          <w:right w:val="single" w:sz="4" w:space="0" w:color="auto"/>
-          <w:insideH w:val="single" w:sz="4" w:space="0" w:color="auto"/>
-          <w:insideV w:val="single" w:sz="4" w:space="0" w:color="auto"/>
-        </w:tblBorders>
-        <w:tblCellMar>
-          <w:left w:w="10" w:type="dxa"/>
-          <w:right w:w="10" w:type="dxa"/>
-        </w:tblCellMar>
         <w:tblLook w:val="04A0" w:firstRow="1" w:lastRow="0" w:firstColumn="1" w:lastColumn="0" w:noHBand="0" w:noVBand="1"/>
       </w:tblPr>
       <w:tblGrid>
@@ -873,37 +727,16 @@
         <w:gridCol w:w="6560"/>
       </w:tblGrid>
       <w:tr>
-        <w:tblPrEx>
-          <w:tblCellMar>
-            <w:top w:w="0" w:type="dxa"/>
-            <w:bottom w:w="0" w:type="dxa"/>
-          </w:tblCellMar>
-        </w:tblPrEx>
-        <w:trPr>
-          <w:tblHeader/>
-        </w:trPr>
         <w:tc>
           <w:tcPr>
             <w:tcW w:w="2800" w:type="dxa"/>
-            <w:tcBorders>
-              <w:top w:val="single" w:sz="4" w:space="0" w:color="DDD8CC"/>
-              <w:left w:val="single" w:sz="4" w:space="0" w:color="DDD8CC"/>
-              <w:bottom w:val="single" w:sz="4" w:space="0" w:color="DDD8CC"/>
-              <w:right w:val="single" w:sz="4" w:space="0" w:color="DDD8CC"/>
-            </w:tcBorders>
-            <w:shd w:val="clear" w:color="auto" w:fill="EDF7F2"/>
-            <w:tcMar>
-              <w:top w:w="80" w:type="dxa"/>
-              <w:left w:w="120" w:type="dxa"/>
-              <w:bottom w:w="80" w:type="dxa"/>
-              <w:right w:w="120" w:type="dxa"/>
-            </w:tcMar>
           </w:tcPr>
           <w:p>
             <w:pPr>
               <w:spacing w:before="60" w:after="100"/>
               <w:rPr>
                 <w:rFonts w:ascii="Garamond" w:hAnsi="Garamond"/>
+                <w:color w:val="000000" w:themeColor="text1"/>
               </w:rPr>
             </w:pPr>
             <w:r>
@@ -911,6 +744,7 @@
                 <w:rFonts w:ascii="Garamond" w:hAnsi="Garamond"/>
                 <w:b/>
                 <w:bCs/>
+                <w:color w:val="000000" w:themeColor="text1"/>
               </w:rPr>
               <w:t>Role</w:t>
             </w:r>
@@ -919,25 +753,13 @@
         <w:tc>
           <w:tcPr>
             <w:tcW w:w="6560" w:type="dxa"/>
-            <w:tcBorders>
-              <w:top w:val="single" w:sz="4" w:space="0" w:color="DDD8CC"/>
-              <w:left w:val="single" w:sz="4" w:space="0" w:color="DDD8CC"/>
-              <w:bottom w:val="single" w:sz="4" w:space="0" w:color="DDD8CC"/>
-              <w:right w:val="single" w:sz="4" w:space="0" w:color="DDD8CC"/>
-            </w:tcBorders>
-            <w:shd w:val="clear" w:color="auto" w:fill="EDF7F2"/>
-            <w:tcMar>
-              <w:top w:w="80" w:type="dxa"/>
-              <w:left w:w="120" w:type="dxa"/>
-              <w:bottom w:w="80" w:type="dxa"/>
-              <w:right w:w="120" w:type="dxa"/>
-            </w:tcMar>
           </w:tcPr>
           <w:p>
             <w:pPr>
               <w:spacing w:before="60" w:after="100"/>
               <w:rPr>
                 <w:rFonts w:ascii="Garamond" w:hAnsi="Garamond"/>
+                <w:color w:val="000000" w:themeColor="text1"/>
               </w:rPr>
             </w:pPr>
             <w:r>
@@ -945,6 +767,7 @@
                 <w:rFonts w:ascii="Garamond" w:hAnsi="Garamond"/>
                 <w:b/>
                 <w:bCs/>
+                <w:color w:val="000000" w:themeColor="text1"/>
               </w:rPr>
               <w:t>Variable (name it)</w:t>
             </w:r>
@@ -952,33 +775,16 @@
         </w:tc>
       </w:tr>
       <w:tr>
-        <w:tblPrEx>
-          <w:tblCellMar>
-            <w:top w:w="0" w:type="dxa"/>
-            <w:bottom w:w="0" w:type="dxa"/>
-          </w:tblCellMar>
-        </w:tblPrEx>
         <w:tc>
           <w:tcPr>
             <w:tcW w:w="2800" w:type="dxa"/>
-            <w:tcBorders>
-              <w:top w:val="single" w:sz="4" w:space="0" w:color="DDD8CC"/>
-              <w:left w:val="single" w:sz="4" w:space="0" w:color="DDD8CC"/>
-              <w:bottom w:val="single" w:sz="4" w:space="0" w:color="DDD8CC"/>
-              <w:right w:val="single" w:sz="4" w:space="0" w:color="DDD8CC"/>
-            </w:tcBorders>
-            <w:tcMar>
-              <w:top w:w="80" w:type="dxa"/>
-              <w:left w:w="120" w:type="dxa"/>
-              <w:bottom w:w="80" w:type="dxa"/>
-              <w:right w:w="120" w:type="dxa"/>
-            </w:tcMar>
           </w:tcPr>
           <w:p>
             <w:pPr>
               <w:spacing w:before="60" w:after="100"/>
               <w:rPr>
                 <w:rFonts w:ascii="Garamond" w:hAnsi="Garamond"/>
+                <w:color w:val="000000" w:themeColor="text1"/>
               </w:rPr>
             </w:pPr>
             <w:r>
@@ -986,6 +792,7 @@
                 <w:rFonts w:ascii="Garamond" w:hAnsi="Garamond"/>
                 <w:b/>
                 <w:bCs/>
+                <w:color w:val="000000" w:themeColor="text1"/>
               </w:rPr>
               <w:t>Explanatory (EV)</w:t>
             </w:r>
@@ -994,30 +801,19 @@
         <w:tc>
           <w:tcPr>
             <w:tcW w:w="6560" w:type="dxa"/>
-            <w:tcBorders>
-              <w:top w:val="single" w:sz="4" w:space="0" w:color="DDD8CC"/>
-              <w:left w:val="single" w:sz="4" w:space="0" w:color="DDD8CC"/>
-              <w:bottom w:val="single" w:sz="4" w:space="0" w:color="DDD8CC"/>
-              <w:right w:val="single" w:sz="4" w:space="0" w:color="DDD8CC"/>
-            </w:tcBorders>
-            <w:tcMar>
-              <w:top w:w="80" w:type="dxa"/>
-              <w:left w:w="120" w:type="dxa"/>
-              <w:bottom w:w="80" w:type="dxa"/>
-              <w:right w:w="120" w:type="dxa"/>
-            </w:tcMar>
           </w:tcPr>
           <w:p>
             <w:pPr>
               <w:spacing w:before="60" w:after="100"/>
               <w:rPr>
                 <w:rFonts w:ascii="Garamond" w:hAnsi="Garamond"/>
-              </w:rPr>
-            </w:pPr>
-            <w:r>
-              <w:rPr>
-                <w:rFonts w:ascii="Garamond" w:hAnsi="Garamond"/>
-                <w:color w:val="AAAAAA"/>
+                <w:color w:val="000000" w:themeColor="text1"/>
+              </w:rPr>
+            </w:pPr>
+            <w:r>
+              <w:rPr>
+                <w:rFonts w:ascii="Garamond" w:hAnsi="Garamond"/>
+                <w:color w:val="000000" w:themeColor="text1"/>
                 <w:u w:val="single"/>
               </w:rPr>
               <w:t>                                                  </w:t>
@@ -1026,33 +822,16 @@
         </w:tc>
       </w:tr>
       <w:tr>
-        <w:tblPrEx>
-          <w:tblCellMar>
-            <w:top w:w="0" w:type="dxa"/>
-            <w:bottom w:w="0" w:type="dxa"/>
-          </w:tblCellMar>
-        </w:tblPrEx>
         <w:tc>
           <w:tcPr>
             <w:tcW w:w="2800" w:type="dxa"/>
-            <w:tcBorders>
-              <w:top w:val="single" w:sz="4" w:space="0" w:color="DDD8CC"/>
-              <w:left w:val="single" w:sz="4" w:space="0" w:color="DDD8CC"/>
-              <w:bottom w:val="single" w:sz="4" w:space="0" w:color="DDD8CC"/>
-              <w:right w:val="single" w:sz="4" w:space="0" w:color="DDD8CC"/>
-            </w:tcBorders>
-            <w:tcMar>
-              <w:top w:w="80" w:type="dxa"/>
-              <w:left w:w="120" w:type="dxa"/>
-              <w:bottom w:w="80" w:type="dxa"/>
-              <w:right w:w="120" w:type="dxa"/>
-            </w:tcMar>
           </w:tcPr>
           <w:p>
             <w:pPr>
               <w:spacing w:before="60" w:after="100"/>
               <w:rPr>
                 <w:rFonts w:ascii="Garamond" w:hAnsi="Garamond"/>
+                <w:color w:val="000000" w:themeColor="text1"/>
               </w:rPr>
             </w:pPr>
             <w:r>
@@ -1060,6 +839,7 @@
                 <w:rFonts w:ascii="Garamond" w:hAnsi="Garamond"/>
                 <w:b/>
                 <w:bCs/>
+                <w:color w:val="000000" w:themeColor="text1"/>
               </w:rPr>
               <w:t>Response (RV)</w:t>
             </w:r>
@@ -1068,30 +848,19 @@
         <w:tc>
           <w:tcPr>
             <w:tcW w:w="6560" w:type="dxa"/>
-            <w:tcBorders>
-              <w:top w:val="single" w:sz="4" w:space="0" w:color="DDD8CC"/>
-              <w:left w:val="single" w:sz="4" w:space="0" w:color="DDD8CC"/>
-              <w:bottom w:val="single" w:sz="4" w:space="0" w:color="DDD8CC"/>
-              <w:right w:val="single" w:sz="4" w:space="0" w:color="DDD8CC"/>
-            </w:tcBorders>
-            <w:tcMar>
-              <w:top w:w="80" w:type="dxa"/>
-              <w:left w:w="120" w:type="dxa"/>
-              <w:bottom w:w="80" w:type="dxa"/>
-              <w:right w:w="120" w:type="dxa"/>
-            </w:tcMar>
           </w:tcPr>
           <w:p>
             <w:pPr>
               <w:spacing w:before="60" w:after="100"/>
               <w:rPr>
                 <w:rFonts w:ascii="Garamond" w:hAnsi="Garamond"/>
-              </w:rPr>
-            </w:pPr>
-            <w:r>
-              <w:rPr>
-                <w:rFonts w:ascii="Garamond" w:hAnsi="Garamond"/>
-                <w:color w:val="AAAAAA"/>
+                <w:color w:val="000000" w:themeColor="text1"/>
+              </w:rPr>
+            </w:pPr>
+            <w:r>
+              <w:rPr>
+                <w:rFonts w:ascii="Garamond" w:hAnsi="Garamond"/>
+                <w:color w:val="000000" w:themeColor="text1"/>
                 <w:u w:val="single"/>
               </w:rPr>
               <w:t>                                                  </w:t>
@@ -1105,6 +874,25 @@
         <w:spacing w:before="240" w:after="240"/>
         <w:rPr>
           <w:rFonts w:ascii="Garamond" w:hAnsi="Garamond"/>
+          <w:color w:val="000000" w:themeColor="text1"/>
+        </w:rPr>
+      </w:pPr>
+    </w:p>
+    <w:p>
+      <w:pPr>
+        <w:spacing w:before="240" w:after="240"/>
+        <w:rPr>
+          <w:rFonts w:ascii="Garamond" w:hAnsi="Garamond"/>
+          <w:color w:val="000000" w:themeColor="text1"/>
+        </w:rPr>
+      </w:pPr>
+    </w:p>
+    <w:p>
+      <w:pPr>
+        <w:spacing w:before="240" w:after="240"/>
+        <w:rPr>
+          <w:rFonts w:ascii="Garamond" w:hAnsi="Garamond"/>
+          <w:color w:val="000000" w:themeColor="text1"/>
         </w:rPr>
       </w:pPr>
     </w:p>
@@ -1113,6 +901,7 @@
         <w:spacing w:before="160" w:after="80"/>
         <w:rPr>
           <w:rFonts w:ascii="Garamond" w:hAnsi="Garamond"/>
+          <w:color w:val="000000" w:themeColor="text1"/>
         </w:rPr>
       </w:pPr>
       <w:r>
@@ -1120,7 +909,7 @@
           <w:rFonts w:ascii="Garamond" w:hAnsi="Garamond"/>
           <w:b/>
           <w:bCs/>
-          <w:color w:val="154734"/>
+          <w:color w:val="000000" w:themeColor="text1"/>
         </w:rPr>
         <w:lastRenderedPageBreak/>
         <w:t>(c)  Type of Each Variable</w:t>
@@ -1128,19 +917,8 @@
     </w:p>
     <w:tbl>
       <w:tblPr>
+        <w:tblStyle w:val="TableGrid"/>
         <w:tblW w:w="9360" w:type="dxa"/>
-        <w:tblBorders>
-          <w:top w:val="single" w:sz="4" w:space="0" w:color="auto"/>
-          <w:left w:val="single" w:sz="4" w:space="0" w:color="auto"/>
-          <w:bottom w:val="single" w:sz="4" w:space="0" w:color="auto"/>
-          <w:right w:val="single" w:sz="4" w:space="0" w:color="auto"/>
-          <w:insideH w:val="single" w:sz="4" w:space="0" w:color="auto"/>
-          <w:insideV w:val="single" w:sz="4" w:space="0" w:color="auto"/>
-        </w:tblBorders>
-        <w:tblCellMar>
-          <w:left w:w="10" w:type="dxa"/>
-          <w:right w:w="10" w:type="dxa"/>
-        </w:tblCellMar>
         <w:tblLook w:val="04A0" w:firstRow="1" w:lastRow="0" w:firstColumn="1" w:lastColumn="0" w:noHBand="0" w:noVBand="1"/>
       </w:tblPr>
       <w:tblGrid>
@@ -1149,37 +927,16 @@
         <w:gridCol w:w="3360"/>
       </w:tblGrid>
       <w:tr>
-        <w:tblPrEx>
-          <w:tblCellMar>
-            <w:top w:w="0" w:type="dxa"/>
-            <w:bottom w:w="0" w:type="dxa"/>
-          </w:tblCellMar>
-        </w:tblPrEx>
-        <w:trPr>
-          <w:tblHeader/>
-        </w:trPr>
         <w:tc>
           <w:tcPr>
             <w:tcW w:w="3200" w:type="dxa"/>
-            <w:tcBorders>
-              <w:top w:val="single" w:sz="4" w:space="0" w:color="DDD8CC"/>
-              <w:left w:val="single" w:sz="4" w:space="0" w:color="DDD8CC"/>
-              <w:bottom w:val="single" w:sz="4" w:space="0" w:color="DDD8CC"/>
-              <w:right w:val="single" w:sz="4" w:space="0" w:color="DDD8CC"/>
-            </w:tcBorders>
-            <w:shd w:val="clear" w:color="auto" w:fill="EDF7F2"/>
-            <w:tcMar>
-              <w:top w:w="80" w:type="dxa"/>
-              <w:left w:w="120" w:type="dxa"/>
-              <w:bottom w:w="80" w:type="dxa"/>
-              <w:right w:w="120" w:type="dxa"/>
-            </w:tcMar>
           </w:tcPr>
           <w:p>
             <w:pPr>
               <w:spacing w:before="60" w:after="100"/>
               <w:rPr>
                 <w:rFonts w:ascii="Garamond" w:hAnsi="Garamond"/>
+                <w:color w:val="000000" w:themeColor="text1"/>
               </w:rPr>
             </w:pPr>
             <w:r>
@@ -1187,6 +944,7 @@
                 <w:rFonts w:ascii="Garamond" w:hAnsi="Garamond"/>
                 <w:b/>
                 <w:bCs/>
+                <w:color w:val="000000" w:themeColor="text1"/>
               </w:rPr>
               <w:t>Variable</w:t>
             </w:r>
@@ -1195,25 +953,13 @@
         <w:tc>
           <w:tcPr>
             <w:tcW w:w="2800" w:type="dxa"/>
-            <w:tcBorders>
-              <w:top w:val="single" w:sz="4" w:space="0" w:color="DDD8CC"/>
-              <w:left w:val="single" w:sz="4" w:space="0" w:color="DDD8CC"/>
-              <w:bottom w:val="single" w:sz="4" w:space="0" w:color="DDD8CC"/>
-              <w:right w:val="single" w:sz="4" w:space="0" w:color="DDD8CC"/>
-            </w:tcBorders>
-            <w:shd w:val="clear" w:color="auto" w:fill="EDF7F2"/>
-            <w:tcMar>
-              <w:top w:w="80" w:type="dxa"/>
-              <w:left w:w="120" w:type="dxa"/>
-              <w:bottom w:w="80" w:type="dxa"/>
-              <w:right w:w="120" w:type="dxa"/>
-            </w:tcMar>
           </w:tcPr>
           <w:p>
             <w:pPr>
               <w:spacing w:before="60" w:after="100"/>
               <w:rPr>
                 <w:rFonts w:ascii="Garamond" w:hAnsi="Garamond"/>
+                <w:color w:val="000000" w:themeColor="text1"/>
               </w:rPr>
             </w:pPr>
             <w:r>
@@ -1221,6 +967,7 @@
                 <w:rFonts w:ascii="Garamond" w:hAnsi="Garamond"/>
                 <w:b/>
                 <w:bCs/>
+                <w:color w:val="000000" w:themeColor="text1"/>
               </w:rPr>
               <w:t>Type</w:t>
             </w:r>
@@ -1229,25 +976,13 @@
         <w:tc>
           <w:tcPr>
             <w:tcW w:w="3360" w:type="dxa"/>
-            <w:tcBorders>
-              <w:top w:val="single" w:sz="4" w:space="0" w:color="DDD8CC"/>
-              <w:left w:val="single" w:sz="4" w:space="0" w:color="DDD8CC"/>
-              <w:bottom w:val="single" w:sz="4" w:space="0" w:color="DDD8CC"/>
-              <w:right w:val="single" w:sz="4" w:space="0" w:color="DDD8CC"/>
-            </w:tcBorders>
-            <w:shd w:val="clear" w:color="auto" w:fill="EDF7F2"/>
-            <w:tcMar>
-              <w:top w:w="80" w:type="dxa"/>
-              <w:left w:w="120" w:type="dxa"/>
-              <w:bottom w:w="80" w:type="dxa"/>
-              <w:right w:w="120" w:type="dxa"/>
-            </w:tcMar>
           </w:tcPr>
           <w:p>
             <w:pPr>
               <w:spacing w:before="60" w:after="100"/>
               <w:rPr>
                 <w:rFonts w:ascii="Garamond" w:hAnsi="Garamond"/>
+                <w:color w:val="000000" w:themeColor="text1"/>
               </w:rPr>
             </w:pPr>
             <w:r>
@@ -1255,6 +990,7 @@
                 <w:rFonts w:ascii="Garamond" w:hAnsi="Garamond"/>
                 <w:b/>
                 <w:bCs/>
+                <w:color w:val="000000" w:themeColor="text1"/>
               </w:rPr>
               <w:t>How many categories / units?</w:t>
             </w:r>
@@ -1262,32 +998,23 @@
         </w:tc>
       </w:tr>
       <w:tr>
-        <w:tblPrEx>
-          <w:tblCellMar>
-            <w:top w:w="0" w:type="dxa"/>
-            <w:bottom w:w="0" w:type="dxa"/>
-          </w:tblCellMar>
-        </w:tblPrEx>
         <w:tc>
           <w:tcPr>
             <w:tcW w:w="3200" w:type="dxa"/>
-            <w:tcBorders>
-              <w:top w:val="single" w:sz="4" w:space="0" w:color="DDD8CC"/>
-              <w:left w:val="single" w:sz="4" w:space="0" w:color="DDD8CC"/>
-              <w:bottom w:val="single" w:sz="4" w:space="0" w:color="DDD8CC"/>
-              <w:right w:val="single" w:sz="4" w:space="0" w:color="DDD8CC"/>
-            </w:tcBorders>
-            <w:tcMar>
-              <w:top w:w="80" w:type="dxa"/>
-              <w:left w:w="120" w:type="dxa"/>
-              <w:bottom w:w="80" w:type="dxa"/>
-              <w:right w:w="120" w:type="dxa"/>
-            </w:tcMar>
-          </w:tcPr>
-          <w:p>
-            <w:pPr>
-              <w:rPr>
-                <w:rFonts w:ascii="Garamond" w:hAnsi="Garamond"/>
+          </w:tcPr>
+          <w:p>
+            <w:pPr>
+              <w:rPr>
+                <w:rFonts w:ascii="Garamond" w:hAnsi="Garamond"/>
+                <w:color w:val="000000" w:themeColor="text1"/>
+              </w:rPr>
+            </w:pPr>
+          </w:p>
+          <w:p>
+            <w:pPr>
+              <w:rPr>
+                <w:rFonts w:ascii="Garamond" w:hAnsi="Garamond"/>
+                <w:color w:val="000000" w:themeColor="text1"/>
               </w:rPr>
             </w:pPr>
           </w:p>
@@ -1295,97 +1022,67 @@
         <w:tc>
           <w:tcPr>
             <w:tcW w:w="2800" w:type="dxa"/>
-            <w:tcBorders>
-              <w:top w:val="single" w:sz="4" w:space="0" w:color="DDD8CC"/>
-              <w:left w:val="single" w:sz="4" w:space="0" w:color="DDD8CC"/>
-              <w:bottom w:val="single" w:sz="4" w:space="0" w:color="DDD8CC"/>
-              <w:right w:val="single" w:sz="4" w:space="0" w:color="DDD8CC"/>
-            </w:tcBorders>
-            <w:tcMar>
-              <w:top w:w="80" w:type="dxa"/>
-              <w:left w:w="120" w:type="dxa"/>
-              <w:bottom w:w="80" w:type="dxa"/>
-              <w:right w:w="120" w:type="dxa"/>
-            </w:tcMar>
           </w:tcPr>
           <w:p>
             <w:pPr>
               <w:spacing w:before="60" w:after="100"/>
               <w:rPr>
                 <w:rFonts w:ascii="Garamond" w:hAnsi="Garamond"/>
-              </w:rPr>
-            </w:pPr>
-            <w:r>
-              <w:rPr>
-                <w:rFonts w:ascii="Garamond" w:hAnsi="Garamond"/>
-                <w:color w:val="AAAAAA"/>
-                <w:u w:val="single"/>
-              </w:rPr>
-              <w:t>                  </w:t>
-            </w:r>
+                <w:color w:val="000000" w:themeColor="text1"/>
+              </w:rPr>
+            </w:pPr>
+          </w:p>
+          <w:p>
+            <w:pPr>
+              <w:spacing w:before="60" w:after="100"/>
+              <w:rPr>
+                <w:rFonts w:ascii="Garamond" w:hAnsi="Garamond"/>
+                <w:color w:val="000000" w:themeColor="text1"/>
+              </w:rPr>
+            </w:pPr>
           </w:p>
         </w:tc>
         <w:tc>
           <w:tcPr>
             <w:tcW w:w="3360" w:type="dxa"/>
-            <w:tcBorders>
-              <w:top w:val="single" w:sz="4" w:space="0" w:color="DDD8CC"/>
-              <w:left w:val="single" w:sz="4" w:space="0" w:color="DDD8CC"/>
-              <w:bottom w:val="single" w:sz="4" w:space="0" w:color="DDD8CC"/>
-              <w:right w:val="single" w:sz="4" w:space="0" w:color="DDD8CC"/>
-            </w:tcBorders>
-            <w:tcMar>
-              <w:top w:w="80" w:type="dxa"/>
-              <w:left w:w="120" w:type="dxa"/>
-              <w:bottom w:w="80" w:type="dxa"/>
-              <w:right w:w="120" w:type="dxa"/>
-            </w:tcMar>
           </w:tcPr>
           <w:p>
             <w:pPr>
               <w:spacing w:before="60" w:after="100"/>
               <w:rPr>
                 <w:rFonts w:ascii="Garamond" w:hAnsi="Garamond"/>
-              </w:rPr>
-            </w:pPr>
-            <w:r>
-              <w:rPr>
-                <w:rFonts w:ascii="Garamond" w:hAnsi="Garamond"/>
-                <w:color w:val="AAAAAA"/>
-                <w:u w:val="single"/>
-              </w:rPr>
-              <w:t>                      </w:t>
-            </w:r>
+                <w:color w:val="000000" w:themeColor="text1"/>
+              </w:rPr>
+            </w:pPr>
           </w:p>
         </w:tc>
       </w:tr>
       <w:tr>
-        <w:tblPrEx>
-          <w:tblCellMar>
-            <w:top w:w="0" w:type="dxa"/>
-            <w:bottom w:w="0" w:type="dxa"/>
-          </w:tblCellMar>
-        </w:tblPrEx>
         <w:tc>
           <w:tcPr>
             <w:tcW w:w="3200" w:type="dxa"/>
-            <w:tcBorders>
-              <w:top w:val="single" w:sz="4" w:space="0" w:color="DDD8CC"/>
-              <w:left w:val="single" w:sz="4" w:space="0" w:color="DDD8CC"/>
-              <w:bottom w:val="single" w:sz="4" w:space="0" w:color="DDD8CC"/>
-              <w:right w:val="single" w:sz="4" w:space="0" w:color="DDD8CC"/>
-            </w:tcBorders>
-            <w:tcMar>
-              <w:top w:w="80" w:type="dxa"/>
-              <w:left w:w="120" w:type="dxa"/>
-              <w:bottom w:w="80" w:type="dxa"/>
-              <w:right w:w="120" w:type="dxa"/>
-            </w:tcMar>
-          </w:tcPr>
-          <w:p>
-            <w:pPr>
-              <w:rPr>
-                <w:rFonts w:ascii="Garamond" w:hAnsi="Garamond"/>
+          </w:tcPr>
+          <w:p>
+            <w:pPr>
+              <w:rPr>
+                <w:rFonts w:ascii="Garamond" w:hAnsi="Garamond"/>
+                <w:color w:val="000000" w:themeColor="text1"/>
+              </w:rPr>
+            </w:pPr>
+          </w:p>
+          <w:p>
+            <w:pPr>
+              <w:rPr>
+                <w:rFonts w:ascii="Garamond" w:hAnsi="Garamond"/>
+                <w:color w:val="000000" w:themeColor="text1"/>
+              </w:rPr>
+            </w:pPr>
+          </w:p>
+          <w:p>
+            <w:pPr>
+              <w:rPr>
+                <w:rFonts w:ascii="Garamond" w:hAnsi="Garamond"/>
+                <w:color w:val="000000" w:themeColor="text1"/>
               </w:rPr>
             </w:pPr>
           </w:p>
@@ -1393,67 +1090,29 @@
         <w:tc>
           <w:tcPr>
             <w:tcW w:w="2800" w:type="dxa"/>
-            <w:tcBorders>
-              <w:top w:val="single" w:sz="4" w:space="0" w:color="DDD8CC"/>
-              <w:left w:val="single" w:sz="4" w:space="0" w:color="DDD8CC"/>
-              <w:bottom w:val="single" w:sz="4" w:space="0" w:color="DDD8CC"/>
-              <w:right w:val="single" w:sz="4" w:space="0" w:color="DDD8CC"/>
-            </w:tcBorders>
-            <w:tcMar>
-              <w:top w:w="80" w:type="dxa"/>
-              <w:left w:w="120" w:type="dxa"/>
-              <w:bottom w:w="80" w:type="dxa"/>
-              <w:right w:w="120" w:type="dxa"/>
-            </w:tcMar>
           </w:tcPr>
           <w:p>
             <w:pPr>
               <w:spacing w:before="60" w:after="100"/>
               <w:rPr>
                 <w:rFonts w:ascii="Garamond" w:hAnsi="Garamond"/>
-              </w:rPr>
-            </w:pPr>
-            <w:r>
-              <w:rPr>
-                <w:rFonts w:ascii="Garamond" w:hAnsi="Garamond"/>
-                <w:color w:val="AAAAAA"/>
-                <w:u w:val="single"/>
-              </w:rPr>
-              <w:t>                  </w:t>
-            </w:r>
+                <w:color w:val="000000" w:themeColor="text1"/>
+              </w:rPr>
+            </w:pPr>
           </w:p>
         </w:tc>
         <w:tc>
           <w:tcPr>
             <w:tcW w:w="3360" w:type="dxa"/>
-            <w:tcBorders>
-              <w:top w:val="single" w:sz="4" w:space="0" w:color="DDD8CC"/>
-              <w:left w:val="single" w:sz="4" w:space="0" w:color="DDD8CC"/>
-              <w:bottom w:val="single" w:sz="4" w:space="0" w:color="DDD8CC"/>
-              <w:right w:val="single" w:sz="4" w:space="0" w:color="DDD8CC"/>
-            </w:tcBorders>
-            <w:tcMar>
-              <w:top w:w="80" w:type="dxa"/>
-              <w:left w:w="120" w:type="dxa"/>
-              <w:bottom w:w="80" w:type="dxa"/>
-              <w:right w:w="120" w:type="dxa"/>
-            </w:tcMar>
           </w:tcPr>
           <w:p>
             <w:pPr>
               <w:spacing w:before="60" w:after="100"/>
               <w:rPr>
                 <w:rFonts w:ascii="Garamond" w:hAnsi="Garamond"/>
-              </w:rPr>
-            </w:pPr>
-            <w:r>
-              <w:rPr>
-                <w:rFonts w:ascii="Garamond" w:hAnsi="Garamond"/>
-                <w:color w:val="AAAAAA"/>
-                <w:u w:val="single"/>
-              </w:rPr>
-              <w:t>                      </w:t>
-            </w:r>
+                <w:color w:val="000000" w:themeColor="text1"/>
+              </w:rPr>
+            </w:pPr>
           </w:p>
         </w:tc>
       </w:tr>
@@ -1466,6 +1125,7 @@
         <w:spacing w:before="200" w:after="200"/>
         <w:rPr>
           <w:rFonts w:ascii="Garamond" w:hAnsi="Garamond"/>
+          <w:color w:val="000000" w:themeColor="text1"/>
         </w:rPr>
       </w:pPr>
     </w:p>
@@ -1477,6 +1137,7 @@
         <w:spacing w:before="280" w:after="100"/>
         <w:rPr>
           <w:rFonts w:ascii="Garamond" w:hAnsi="Garamond"/>
+          <w:color w:val="000000" w:themeColor="text1"/>
         </w:rPr>
       </w:pPr>
       <w:r>
@@ -1484,7 +1145,7 @@
           <w:rFonts w:ascii="Garamond" w:hAnsi="Garamond"/>
           <w:b/>
           <w:bCs/>
-          <w:color w:val="154734"/>
+          <w:color w:val="000000" w:themeColor="text1"/>
           <w:sz w:val="26"/>
           <w:szCs w:val="26"/>
         </w:rPr>
@@ -1496,11 +1157,13 @@
         <w:spacing w:before="60" w:after="100"/>
         <w:rPr>
           <w:rFonts w:ascii="Garamond" w:hAnsi="Garamond"/>
-        </w:rPr>
-      </w:pPr>
-      <w:r>
-        <w:rPr>
-          <w:rFonts w:ascii="Garamond" w:hAnsi="Garamond"/>
+          <w:color w:val="000000" w:themeColor="text1"/>
+        </w:rPr>
+      </w:pPr>
+      <w:r>
+        <w:rPr>
+          <w:rFonts w:ascii="Garamond" w:hAnsi="Garamond"/>
+          <w:color w:val="000000" w:themeColor="text1"/>
         </w:rPr>
         <w:t xml:space="preserve">State the null and alternative hypotheses using proper notation. Let </w:t>
       </w:r>
@@ -1508,6 +1171,7 @@
       <w:r>
         <w:rPr>
           <w:rFonts w:ascii="Garamond" w:eastAsia="Courier New" w:hAnsi="Garamond" w:cs="Courier New"/>
+          <w:color w:val="000000" w:themeColor="text1"/>
           <w:sz w:val="20"/>
           <w:szCs w:val="20"/>
         </w:rPr>
@@ -1517,6 +1181,7 @@
       <w:r>
         <w:rPr>
           <w:rFonts w:ascii="Garamond" w:hAnsi="Garamond"/>
+          <w:color w:val="000000" w:themeColor="text1"/>
         </w:rPr>
         <w:t xml:space="preserve">, </w:t>
       </w:r>
@@ -1524,6 +1189,7 @@
       <w:r>
         <w:rPr>
           <w:rFonts w:ascii="Garamond" w:eastAsia="Courier New" w:hAnsi="Garamond" w:cs="Courier New"/>
+          <w:color w:val="000000" w:themeColor="text1"/>
           <w:sz w:val="20"/>
           <w:szCs w:val="20"/>
         </w:rPr>
@@ -1533,6 +1199,7 @@
       <w:r>
         <w:rPr>
           <w:rFonts w:ascii="Garamond" w:hAnsi="Garamond"/>
+          <w:color w:val="000000" w:themeColor="text1"/>
         </w:rPr>
         <w:t xml:space="preserve">, </w:t>
       </w:r>
@@ -1540,6 +1207,7 @@
       <w:r>
         <w:rPr>
           <w:rFonts w:ascii="Garamond" w:eastAsia="Courier New" w:hAnsi="Garamond" w:cs="Courier New"/>
+          <w:color w:val="000000" w:themeColor="text1"/>
           <w:sz w:val="20"/>
           <w:szCs w:val="20"/>
         </w:rPr>
@@ -1549,6 +1217,7 @@
       <w:r>
         <w:rPr>
           <w:rFonts w:ascii="Garamond" w:hAnsi="Garamond"/>
+          <w:color w:val="000000" w:themeColor="text1"/>
         </w:rPr>
         <w:t xml:space="preserve"> denote the population mean exam score for each study method group.</w:t>
       </w:r>
@@ -1558,6 +1227,7 @@
         <w:spacing w:before="160" w:after="80"/>
         <w:rPr>
           <w:rFonts w:ascii="Garamond" w:hAnsi="Garamond"/>
+          <w:color w:val="000000" w:themeColor="text1"/>
         </w:rPr>
       </w:pPr>
       <w:r>
@@ -1565,7 +1235,7 @@
           <w:rFonts w:ascii="Garamond" w:hAnsi="Garamond"/>
           <w:b/>
           <w:bCs/>
-          <w:color w:val="154734"/>
+          <w:color w:val="000000" w:themeColor="text1"/>
         </w:rPr>
         <w:t>Null Hypothesis (H</w:t>
       </w:r>
@@ -1574,7 +1244,7 @@
           <w:rFonts w:ascii="Cambria Math" w:hAnsi="Cambria Math" w:cs="Cambria Math"/>
           <w:b/>
           <w:bCs/>
-          <w:color w:val="154734"/>
+          <w:color w:val="000000" w:themeColor="text1"/>
         </w:rPr>
         <w:t>₀</w:t>
       </w:r>
@@ -1583,7 +1253,7 @@
           <w:rFonts w:ascii="Garamond" w:hAnsi="Garamond"/>
           <w:b/>
           <w:bCs/>
-          <w:color w:val="154734"/>
+          <w:color w:val="000000" w:themeColor="text1"/>
         </w:rPr>
         <w:t>)</w:t>
       </w:r>
@@ -1593,6 +1263,7 @@
         <w:spacing w:before="160" w:after="160"/>
         <w:rPr>
           <w:rFonts w:ascii="Garamond" w:hAnsi="Garamond"/>
+          <w:color w:val="000000" w:themeColor="text1"/>
         </w:rPr>
       </w:pPr>
     </w:p>
@@ -1601,6 +1272,7 @@
         <w:spacing w:before="160" w:after="160"/>
         <w:rPr>
           <w:rFonts w:ascii="Garamond" w:hAnsi="Garamond"/>
+          <w:color w:val="000000" w:themeColor="text1"/>
         </w:rPr>
       </w:pPr>
     </w:p>
@@ -1609,6 +1281,7 @@
         <w:spacing w:before="160" w:after="160"/>
         <w:rPr>
           <w:rFonts w:ascii="Garamond" w:hAnsi="Garamond"/>
+          <w:color w:val="000000" w:themeColor="text1"/>
         </w:rPr>
       </w:pPr>
     </w:p>
@@ -1617,6 +1290,7 @@
         <w:spacing w:before="160" w:after="160"/>
         <w:rPr>
           <w:rFonts w:ascii="Garamond" w:hAnsi="Garamond"/>
+          <w:color w:val="000000" w:themeColor="text1"/>
         </w:rPr>
       </w:pPr>
     </w:p>
@@ -1625,6 +1299,7 @@
         <w:spacing w:before="160" w:after="160"/>
         <w:rPr>
           <w:rFonts w:ascii="Garamond" w:hAnsi="Garamond"/>
+          <w:color w:val="000000" w:themeColor="text1"/>
         </w:rPr>
       </w:pPr>
     </w:p>
@@ -1633,6 +1308,7 @@
         <w:spacing w:before="160" w:after="160"/>
         <w:rPr>
           <w:rFonts w:ascii="Garamond" w:hAnsi="Garamond"/>
+          <w:color w:val="000000" w:themeColor="text1"/>
         </w:rPr>
       </w:pPr>
     </w:p>
@@ -1641,6 +1317,7 @@
         <w:spacing w:before="160" w:after="160"/>
         <w:rPr>
           <w:rFonts w:ascii="Garamond" w:hAnsi="Garamond"/>
+          <w:color w:val="000000" w:themeColor="text1"/>
         </w:rPr>
       </w:pPr>
     </w:p>
@@ -1649,6 +1326,7 @@
         <w:spacing w:before="160" w:after="80"/>
         <w:rPr>
           <w:rFonts w:ascii="Garamond" w:hAnsi="Garamond"/>
+          <w:color w:val="000000" w:themeColor="text1"/>
         </w:rPr>
       </w:pPr>
       <w:r>
@@ -1656,7 +1334,7 @@
           <w:rFonts w:ascii="Garamond" w:hAnsi="Garamond"/>
           <w:b/>
           <w:bCs/>
-          <w:color w:val="154734"/>
+          <w:color w:val="000000" w:themeColor="text1"/>
         </w:rPr>
         <w:t>Alternative Hypothesis (H</w:t>
       </w:r>
@@ -1665,7 +1343,7 @@
           <w:rFonts w:ascii="Cambria Math" w:hAnsi="Cambria Math" w:cs="Cambria Math"/>
           <w:b/>
           <w:bCs/>
-          <w:color w:val="154734"/>
+          <w:color w:val="000000" w:themeColor="text1"/>
         </w:rPr>
         <w:t>ₐ</w:t>
       </w:r>
@@ -1674,7 +1352,7 @@
           <w:rFonts w:ascii="Garamond" w:hAnsi="Garamond"/>
           <w:b/>
           <w:bCs/>
-          <w:color w:val="154734"/>
+          <w:color w:val="000000" w:themeColor="text1"/>
         </w:rPr>
         <w:t>)</w:t>
       </w:r>
@@ -1684,6 +1362,7 @@
         <w:spacing w:before="160" w:after="160"/>
         <w:rPr>
           <w:rFonts w:ascii="Garamond" w:hAnsi="Garamond"/>
+          <w:color w:val="000000" w:themeColor="text1"/>
         </w:rPr>
       </w:pPr>
     </w:p>
@@ -1692,6 +1371,7 @@
         <w:spacing w:before="160" w:after="160"/>
         <w:rPr>
           <w:rFonts w:ascii="Garamond" w:hAnsi="Garamond"/>
+          <w:color w:val="000000" w:themeColor="text1"/>
         </w:rPr>
       </w:pPr>
     </w:p>
@@ -1700,6 +1380,7 @@
         <w:spacing w:before="160" w:after="160"/>
         <w:rPr>
           <w:rFonts w:ascii="Garamond" w:hAnsi="Garamond"/>
+          <w:color w:val="000000" w:themeColor="text1"/>
         </w:rPr>
       </w:pPr>
     </w:p>
@@ -1708,6 +1389,7 @@
         <w:spacing w:before="160" w:after="160"/>
         <w:rPr>
           <w:rFonts w:ascii="Garamond" w:hAnsi="Garamond"/>
+          <w:color w:val="000000" w:themeColor="text1"/>
         </w:rPr>
       </w:pPr>
     </w:p>
@@ -1716,6 +1398,7 @@
         <w:spacing w:before="160" w:after="160"/>
         <w:rPr>
           <w:rFonts w:ascii="Garamond" w:hAnsi="Garamond"/>
+          <w:color w:val="000000" w:themeColor="text1"/>
         </w:rPr>
       </w:pPr>
     </w:p>
@@ -1724,55 +1407,31 @@
         <w:spacing w:before="160" w:after="160"/>
         <w:rPr>
           <w:rFonts w:ascii="Garamond" w:hAnsi="Garamond"/>
+          <w:color w:val="000000" w:themeColor="text1"/>
         </w:rPr>
       </w:pPr>
     </w:p>
     <w:tbl>
       <w:tblPr>
+        <w:tblStyle w:val="TableGrid"/>
         <w:tblW w:w="9360" w:type="dxa"/>
-        <w:tblBorders>
-          <w:top w:val="single" w:sz="4" w:space="0" w:color="auto"/>
-          <w:left w:val="single" w:sz="4" w:space="0" w:color="auto"/>
-          <w:bottom w:val="single" w:sz="4" w:space="0" w:color="auto"/>
-          <w:right w:val="single" w:sz="4" w:space="0" w:color="auto"/>
-          <w:insideH w:val="single" w:sz="4" w:space="0" w:color="auto"/>
-          <w:insideV w:val="single" w:sz="4" w:space="0" w:color="auto"/>
-        </w:tblBorders>
-        <w:tblCellMar>
-          <w:top w:w="100" w:type="dxa"/>
-          <w:left w:w="10" w:type="dxa"/>
-          <w:bottom w:w="100" w:type="dxa"/>
-          <w:right w:w="10" w:type="dxa"/>
-        </w:tblCellMar>
         <w:tblLook w:val="04A0" w:firstRow="1" w:lastRow="0" w:firstColumn="1" w:lastColumn="0" w:noHBand="0" w:noVBand="1"/>
       </w:tblPr>
       <w:tblGrid>
-        <w:gridCol w:w="180"/>
-        <w:gridCol w:w="9180"/>
+        <w:gridCol w:w="222"/>
+        <w:gridCol w:w="9138"/>
       </w:tblGrid>
       <w:tr>
         <w:tc>
           <w:tcPr>
             <w:tcW w:w="180" w:type="dxa"/>
-            <w:tcBorders>
-              <w:top w:val="none" w:sz="0" w:space="0" w:color="FFFFFF"/>
-              <w:left w:val="none" w:sz="0" w:space="0" w:color="FFFFFF"/>
-              <w:bottom w:val="none" w:sz="0" w:space="0" w:color="FFFFFF"/>
-              <w:right w:val="none" w:sz="0" w:space="0" w:color="FFFFFF"/>
-            </w:tcBorders>
-            <w:shd w:val="clear" w:color="auto" w:fill="C69214"/>
-            <w:tcMar>
-              <w:top w:w="60" w:type="dxa"/>
-              <w:left w:w="0" w:type="dxa"/>
-              <w:bottom w:w="60" w:type="dxa"/>
-              <w:right w:w="0" w:type="dxa"/>
-            </w:tcMar>
           </w:tcPr>
           <w:p>
             <w:pPr>
               <w:spacing w:before="60" w:after="100"/>
               <w:rPr>
                 <w:rFonts w:ascii="Garamond" w:hAnsi="Garamond"/>
+                <w:color w:val="000000" w:themeColor="text1"/>
               </w:rPr>
             </w:pPr>
           </w:p>
@@ -1780,25 +1439,13 @@
         <w:tc>
           <w:tcPr>
             <w:tcW w:w="9180" w:type="dxa"/>
-            <w:tcBorders>
-              <w:top w:val="none" w:sz="0" w:space="0" w:color="FFFFFF"/>
-              <w:left w:val="none" w:sz="0" w:space="0" w:color="FFFFFF"/>
-              <w:bottom w:val="none" w:sz="0" w:space="0" w:color="FFFFFF"/>
-              <w:right w:val="none" w:sz="0" w:space="0" w:color="FFFFFF"/>
-            </w:tcBorders>
-            <w:shd w:val="clear" w:color="auto" w:fill="FAF8F2"/>
-            <w:tcMar>
-              <w:top w:w="100" w:type="dxa"/>
-              <w:left w:w="180" w:type="dxa"/>
-              <w:bottom w:w="100" w:type="dxa"/>
-              <w:right w:w="120" w:type="dxa"/>
-            </w:tcMar>
           </w:tcPr>
           <w:p>
             <w:pPr>
               <w:spacing w:before="40" w:after="40"/>
               <w:rPr>
                 <w:rFonts w:ascii="Garamond" w:hAnsi="Garamond"/>
+                <w:color w:val="000000" w:themeColor="text1"/>
               </w:rPr>
             </w:pPr>
             <w:r>
@@ -1806,7 +1453,7 @@
                 <w:rFonts w:ascii="Garamond" w:hAnsi="Garamond"/>
                 <w:b/>
                 <w:bCs/>
-                <w:color w:val="C69214"/>
+                <w:color w:val="000000" w:themeColor="text1"/>
                 <w:sz w:val="20"/>
                 <w:szCs w:val="20"/>
               </w:rPr>
@@ -1815,6 +1462,7 @@
             <w:r>
               <w:rPr>
                 <w:rFonts w:ascii="Garamond" w:hAnsi="Garamond"/>
+                <w:color w:val="000000" w:themeColor="text1"/>
                 <w:sz w:val="20"/>
                 <w:szCs w:val="20"/>
               </w:rPr>
@@ -1825,7 +1473,7 @@
                 <w:rFonts w:ascii="Garamond" w:hAnsi="Garamond"/>
                 <w:b/>
                 <w:bCs/>
-                <w:color w:val="C69214"/>
+                <w:color w:val="000000" w:themeColor="text1"/>
                 <w:sz w:val="20"/>
                 <w:szCs w:val="20"/>
               </w:rPr>
@@ -1834,6 +1482,7 @@
             <w:r>
               <w:rPr>
                 <w:rFonts w:ascii="Garamond" w:hAnsi="Garamond"/>
+                <w:color w:val="000000" w:themeColor="text1"/>
                 <w:sz w:val="20"/>
                 <w:szCs w:val="20"/>
               </w:rPr>
@@ -1844,7 +1493,7 @@
                 <w:rFonts w:ascii="Garamond" w:hAnsi="Garamond"/>
                 <w:b/>
                 <w:bCs/>
-                <w:color w:val="C69214"/>
+                <w:color w:val="000000" w:themeColor="text1"/>
                 <w:sz w:val="20"/>
                 <w:szCs w:val="20"/>
               </w:rPr>
@@ -1853,6 +1502,7 @@
             <w:r>
               <w:rPr>
                 <w:rFonts w:ascii="Garamond" w:hAnsi="Garamond"/>
+                <w:color w:val="000000" w:themeColor="text1"/>
                 <w:sz w:val="20"/>
                 <w:szCs w:val="20"/>
               </w:rPr>
@@ -1868,7 +1518,7 @@
           <w:rFonts w:ascii="Garamond" w:hAnsi="Garamond"/>
           <w:b/>
           <w:bCs/>
-          <w:color w:val="154734"/>
+          <w:color w:val="000000" w:themeColor="text1"/>
           <w:sz w:val="26"/>
           <w:szCs w:val="26"/>
         </w:rPr>
@@ -1878,7 +1528,7 @@
           <w:rFonts w:ascii="Garamond" w:hAnsi="Garamond"/>
           <w:b/>
           <w:bCs/>
-          <w:color w:val="154734"/>
+          <w:color w:val="000000" w:themeColor="text1"/>
           <w:sz w:val="26"/>
           <w:szCs w:val="26"/>
         </w:rPr>
@@ -1889,7 +1539,7 @@
           <w:rFonts w:ascii="Garamond" w:hAnsi="Garamond"/>
           <w:b/>
           <w:bCs/>
-          <w:color w:val="154734"/>
+          <w:color w:val="000000" w:themeColor="text1"/>
           <w:sz w:val="26"/>
           <w:szCs w:val="26"/>
         </w:rPr>
@@ -1902,11 +1552,13 @@
         <w:spacing w:before="60" w:after="100"/>
         <w:rPr>
           <w:rFonts w:ascii="Garamond" w:hAnsi="Garamond"/>
-        </w:rPr>
-      </w:pPr>
-      <w:r>
-        <w:rPr>
-          <w:rFonts w:ascii="Garamond" w:hAnsi="Garamond"/>
+          <w:color w:val="000000" w:themeColor="text1"/>
+        </w:rPr>
+      </w:pPr>
+      <w:r>
+        <w:rPr>
+          <w:rFonts w:ascii="Garamond" w:hAnsi="Garamond"/>
+          <w:color w:val="000000" w:themeColor="text1"/>
         </w:rPr>
         <w:t>The ANOVA output table below summarizes results from this study. Use it to answer the questions that follow.</w:t>
       </w:r>
@@ -1916,26 +1568,14 @@
         <w:spacing w:before="120" w:after="120"/>
         <w:rPr>
           <w:rFonts w:ascii="Garamond" w:hAnsi="Garamond"/>
+          <w:color w:val="000000" w:themeColor="text1"/>
         </w:rPr>
       </w:pPr>
     </w:p>
     <w:tbl>
       <w:tblPr>
+        <w:tblStyle w:val="TableGrid"/>
         <w:tblW w:w="9360" w:type="dxa"/>
-        <w:tblBorders>
-          <w:top w:val="single" w:sz="4" w:space="0" w:color="auto"/>
-          <w:left w:val="single" w:sz="4" w:space="0" w:color="auto"/>
-          <w:bottom w:val="single" w:sz="4" w:space="0" w:color="auto"/>
-          <w:right w:val="single" w:sz="4" w:space="0" w:color="auto"/>
-          <w:insideH w:val="single" w:sz="4" w:space="0" w:color="auto"/>
-          <w:insideV w:val="single" w:sz="4" w:space="0" w:color="auto"/>
-        </w:tblBorders>
-        <w:tblCellMar>
-          <w:top w:w="120" w:type="dxa"/>
-          <w:left w:w="10" w:type="dxa"/>
-          <w:bottom w:w="120" w:type="dxa"/>
-          <w:right w:w="10" w:type="dxa"/>
-        </w:tblCellMar>
         <w:tblLook w:val="04A0" w:firstRow="1" w:lastRow="0" w:firstColumn="1" w:lastColumn="0" w:noHBand="0" w:noVBand="1"/>
       </w:tblPr>
       <w:tblGrid>
@@ -1947,31 +1587,16 @@
         <w:gridCol w:w="1200"/>
       </w:tblGrid>
       <w:tr>
-        <w:trPr>
-          <w:tblHeader/>
-        </w:trPr>
         <w:tc>
           <w:tcPr>
             <w:tcW w:w="2400" w:type="dxa"/>
-            <w:tcBorders>
-              <w:top w:val="single" w:sz="3" w:space="0" w:color="DDD8CC"/>
-              <w:left w:val="single" w:sz="3" w:space="0" w:color="DDD8CC"/>
-              <w:bottom w:val="single" w:sz="3" w:space="0" w:color="DDD8CC"/>
-              <w:right w:val="single" w:sz="3" w:space="0" w:color="DDD8CC"/>
-            </w:tcBorders>
-            <w:shd w:val="clear" w:color="auto" w:fill="EDF7F2"/>
-            <w:tcMar>
-              <w:top w:w="80" w:type="dxa"/>
-              <w:left w:w="120" w:type="dxa"/>
-              <w:bottom w:w="80" w:type="dxa"/>
-              <w:right w:w="120" w:type="dxa"/>
-            </w:tcMar>
           </w:tcPr>
           <w:p>
             <w:pPr>
               <w:spacing w:before="40" w:after="40"/>
               <w:rPr>
                 <w:rFonts w:ascii="Garamond" w:hAnsi="Garamond"/>
+                <w:color w:val="000000" w:themeColor="text1"/>
               </w:rPr>
             </w:pPr>
             <w:r>
@@ -1979,7 +1604,7 @@
                 <w:rFonts w:ascii="Garamond" w:hAnsi="Garamond"/>
                 <w:b/>
                 <w:bCs/>
-                <w:color w:val="154734"/>
+                <w:color w:val="000000" w:themeColor="text1"/>
                 <w:sz w:val="20"/>
                 <w:szCs w:val="20"/>
               </w:rPr>
@@ -1990,25 +1615,13 @@
         <w:tc>
           <w:tcPr>
             <w:tcW w:w="1440" w:type="dxa"/>
-            <w:tcBorders>
-              <w:top w:val="single" w:sz="3" w:space="0" w:color="DDD8CC"/>
-              <w:left w:val="single" w:sz="3" w:space="0" w:color="DDD8CC"/>
-              <w:bottom w:val="single" w:sz="3" w:space="0" w:color="DDD8CC"/>
-              <w:right w:val="single" w:sz="3" w:space="0" w:color="DDD8CC"/>
-            </w:tcBorders>
-            <w:shd w:val="clear" w:color="auto" w:fill="EDF7F2"/>
-            <w:tcMar>
-              <w:top w:w="80" w:type="dxa"/>
-              <w:left w:w="120" w:type="dxa"/>
-              <w:bottom w:w="80" w:type="dxa"/>
-              <w:right w:w="120" w:type="dxa"/>
-            </w:tcMar>
           </w:tcPr>
           <w:p>
             <w:pPr>
               <w:spacing w:before="40" w:after="40"/>
               <w:rPr>
                 <w:rFonts w:ascii="Garamond" w:hAnsi="Garamond"/>
+                <w:color w:val="000000" w:themeColor="text1"/>
               </w:rPr>
             </w:pPr>
             <w:proofErr w:type="spellStart"/>
@@ -2017,7 +1630,7 @@
                 <w:rFonts w:ascii="Garamond" w:hAnsi="Garamond"/>
                 <w:b/>
                 <w:bCs/>
-                <w:color w:val="154734"/>
+                <w:color w:val="000000" w:themeColor="text1"/>
                 <w:sz w:val="20"/>
                 <w:szCs w:val="20"/>
               </w:rPr>
@@ -2029,25 +1642,13 @@
         <w:tc>
           <w:tcPr>
             <w:tcW w:w="1440" w:type="dxa"/>
-            <w:tcBorders>
-              <w:top w:val="single" w:sz="3" w:space="0" w:color="DDD8CC"/>
-              <w:left w:val="single" w:sz="3" w:space="0" w:color="DDD8CC"/>
-              <w:bottom w:val="single" w:sz="3" w:space="0" w:color="DDD8CC"/>
-              <w:right w:val="single" w:sz="3" w:space="0" w:color="DDD8CC"/>
-            </w:tcBorders>
-            <w:shd w:val="clear" w:color="auto" w:fill="EDF7F2"/>
-            <w:tcMar>
-              <w:top w:w="80" w:type="dxa"/>
-              <w:left w:w="120" w:type="dxa"/>
-              <w:bottom w:w="80" w:type="dxa"/>
-              <w:right w:w="120" w:type="dxa"/>
-            </w:tcMar>
           </w:tcPr>
           <w:p>
             <w:pPr>
               <w:spacing w:before="40" w:after="40"/>
               <w:rPr>
                 <w:rFonts w:ascii="Garamond" w:hAnsi="Garamond"/>
+                <w:color w:val="000000" w:themeColor="text1"/>
               </w:rPr>
             </w:pPr>
             <w:r>
@@ -2055,7 +1656,7 @@
                 <w:rFonts w:ascii="Garamond" w:hAnsi="Garamond"/>
                 <w:b/>
                 <w:bCs/>
-                <w:color w:val="154734"/>
+                <w:color w:val="000000" w:themeColor="text1"/>
                 <w:sz w:val="20"/>
                 <w:szCs w:val="20"/>
               </w:rPr>
@@ -2066,25 +1667,13 @@
         <w:tc>
           <w:tcPr>
             <w:tcW w:w="1440" w:type="dxa"/>
-            <w:tcBorders>
-              <w:top w:val="single" w:sz="3" w:space="0" w:color="DDD8CC"/>
-              <w:left w:val="single" w:sz="3" w:space="0" w:color="DDD8CC"/>
-              <w:bottom w:val="single" w:sz="3" w:space="0" w:color="DDD8CC"/>
-              <w:right w:val="single" w:sz="3" w:space="0" w:color="DDD8CC"/>
-            </w:tcBorders>
-            <w:shd w:val="clear" w:color="auto" w:fill="EDF7F2"/>
-            <w:tcMar>
-              <w:top w:w="80" w:type="dxa"/>
-              <w:left w:w="120" w:type="dxa"/>
-              <w:bottom w:w="80" w:type="dxa"/>
-              <w:right w:w="120" w:type="dxa"/>
-            </w:tcMar>
           </w:tcPr>
           <w:p>
             <w:pPr>
               <w:spacing w:before="40" w:after="40"/>
               <w:rPr>
                 <w:rFonts w:ascii="Garamond" w:hAnsi="Garamond"/>
+                <w:color w:val="000000" w:themeColor="text1"/>
               </w:rPr>
             </w:pPr>
             <w:r>
@@ -2092,7 +1681,7 @@
                 <w:rFonts w:ascii="Garamond" w:hAnsi="Garamond"/>
                 <w:b/>
                 <w:bCs/>
-                <w:color w:val="154734"/>
+                <w:color w:val="000000" w:themeColor="text1"/>
                 <w:sz w:val="20"/>
                 <w:szCs w:val="20"/>
               </w:rPr>
@@ -2103,25 +1692,13 @@
         <w:tc>
           <w:tcPr>
             <w:tcW w:w="1440" w:type="dxa"/>
-            <w:tcBorders>
-              <w:top w:val="single" w:sz="3" w:space="0" w:color="DDD8CC"/>
-              <w:left w:val="single" w:sz="3" w:space="0" w:color="DDD8CC"/>
-              <w:bottom w:val="single" w:sz="3" w:space="0" w:color="DDD8CC"/>
-              <w:right w:val="single" w:sz="3" w:space="0" w:color="DDD8CC"/>
-            </w:tcBorders>
-            <w:shd w:val="clear" w:color="auto" w:fill="EDF7F2"/>
-            <w:tcMar>
-              <w:top w:w="80" w:type="dxa"/>
-              <w:left w:w="120" w:type="dxa"/>
-              <w:bottom w:w="80" w:type="dxa"/>
-              <w:right w:w="120" w:type="dxa"/>
-            </w:tcMar>
           </w:tcPr>
           <w:p>
             <w:pPr>
               <w:spacing w:before="40" w:after="40"/>
               <w:rPr>
                 <w:rFonts w:ascii="Garamond" w:hAnsi="Garamond"/>
+                <w:color w:val="000000" w:themeColor="text1"/>
               </w:rPr>
             </w:pPr>
             <w:r>
@@ -2129,7 +1706,7 @@
                 <w:rFonts w:ascii="Garamond" w:hAnsi="Garamond"/>
                 <w:b/>
                 <w:bCs/>
-                <w:color w:val="154734"/>
+                <w:color w:val="000000" w:themeColor="text1"/>
                 <w:sz w:val="20"/>
                 <w:szCs w:val="20"/>
               </w:rPr>
@@ -2140,25 +1717,13 @@
         <w:tc>
           <w:tcPr>
             <w:tcW w:w="1200" w:type="dxa"/>
-            <w:tcBorders>
-              <w:top w:val="single" w:sz="3" w:space="0" w:color="DDD8CC"/>
-              <w:left w:val="single" w:sz="3" w:space="0" w:color="DDD8CC"/>
-              <w:bottom w:val="single" w:sz="3" w:space="0" w:color="DDD8CC"/>
-              <w:right w:val="single" w:sz="3" w:space="0" w:color="DDD8CC"/>
-            </w:tcBorders>
-            <w:shd w:val="clear" w:color="auto" w:fill="EDF7F2"/>
-            <w:tcMar>
-              <w:top w:w="80" w:type="dxa"/>
-              <w:left w:w="120" w:type="dxa"/>
-              <w:bottom w:w="80" w:type="dxa"/>
-              <w:right w:w="120" w:type="dxa"/>
-            </w:tcMar>
           </w:tcPr>
           <w:p>
             <w:pPr>
               <w:spacing w:before="40" w:after="40"/>
               <w:rPr>
                 <w:rFonts w:ascii="Garamond" w:hAnsi="Garamond"/>
+                <w:color w:val="000000" w:themeColor="text1"/>
               </w:rPr>
             </w:pPr>
             <w:r>
@@ -2166,7 +1731,7 @@
                 <w:rFonts w:ascii="Garamond" w:hAnsi="Garamond"/>
                 <w:b/>
                 <w:bCs/>
-                <w:color w:val="154734"/>
+                <w:color w:val="000000" w:themeColor="text1"/>
                 <w:sz w:val="20"/>
                 <w:szCs w:val="20"/>
               </w:rPr>
@@ -2179,29 +1744,19 @@
         <w:tc>
           <w:tcPr>
             <w:tcW w:w="2400" w:type="dxa"/>
-            <w:tcBorders>
-              <w:top w:val="single" w:sz="3" w:space="0" w:color="DDD8CC"/>
-              <w:left w:val="single" w:sz="3" w:space="0" w:color="DDD8CC"/>
-              <w:bottom w:val="single" w:sz="3" w:space="0" w:color="DDD8CC"/>
-              <w:right w:val="single" w:sz="3" w:space="0" w:color="DDD8CC"/>
-            </w:tcBorders>
-            <w:tcMar>
-              <w:top w:w="80" w:type="dxa"/>
-              <w:left w:w="120" w:type="dxa"/>
-              <w:bottom w:w="80" w:type="dxa"/>
-              <w:right w:w="120" w:type="dxa"/>
-            </w:tcMar>
           </w:tcPr>
           <w:p>
             <w:pPr>
               <w:spacing w:before="40" w:after="40"/>
               <w:rPr>
                 <w:rFonts w:ascii="Garamond" w:hAnsi="Garamond"/>
-              </w:rPr>
-            </w:pPr>
-            <w:r>
-              <w:rPr>
-                <w:rFonts w:ascii="Garamond" w:hAnsi="Garamond"/>
+                <w:color w:val="000000" w:themeColor="text1"/>
+              </w:rPr>
+            </w:pPr>
+            <w:r>
+              <w:rPr>
+                <w:rFonts w:ascii="Garamond" w:hAnsi="Garamond"/>
+                <w:color w:val="000000" w:themeColor="text1"/>
                 <w:sz w:val="20"/>
                 <w:szCs w:val="20"/>
               </w:rPr>
@@ -2212,29 +1767,19 @@
         <w:tc>
           <w:tcPr>
             <w:tcW w:w="1440" w:type="dxa"/>
-            <w:tcBorders>
-              <w:top w:val="single" w:sz="3" w:space="0" w:color="DDD8CC"/>
-              <w:left w:val="single" w:sz="3" w:space="0" w:color="DDD8CC"/>
-              <w:bottom w:val="single" w:sz="3" w:space="0" w:color="DDD8CC"/>
-              <w:right w:val="single" w:sz="3" w:space="0" w:color="DDD8CC"/>
-            </w:tcBorders>
-            <w:tcMar>
-              <w:top w:w="80" w:type="dxa"/>
-              <w:left w:w="120" w:type="dxa"/>
-              <w:bottom w:w="80" w:type="dxa"/>
-              <w:right w:w="120" w:type="dxa"/>
-            </w:tcMar>
           </w:tcPr>
           <w:p>
             <w:pPr>
               <w:spacing w:before="40" w:after="40"/>
               <w:rPr>
                 <w:rFonts w:ascii="Garamond" w:hAnsi="Garamond"/>
-              </w:rPr>
-            </w:pPr>
-            <w:r>
-              <w:rPr>
-                <w:rFonts w:ascii="Garamond" w:hAnsi="Garamond"/>
+                <w:color w:val="000000" w:themeColor="text1"/>
+              </w:rPr>
+            </w:pPr>
+            <w:r>
+              <w:rPr>
+                <w:rFonts w:ascii="Garamond" w:hAnsi="Garamond"/>
+                <w:color w:val="000000" w:themeColor="text1"/>
                 <w:sz w:val="20"/>
                 <w:szCs w:val="20"/>
               </w:rPr>
@@ -2245,29 +1790,19 @@
         <w:tc>
           <w:tcPr>
             <w:tcW w:w="1440" w:type="dxa"/>
-            <w:tcBorders>
-              <w:top w:val="single" w:sz="3" w:space="0" w:color="DDD8CC"/>
-              <w:left w:val="single" w:sz="3" w:space="0" w:color="DDD8CC"/>
-              <w:bottom w:val="single" w:sz="3" w:space="0" w:color="DDD8CC"/>
-              <w:right w:val="single" w:sz="3" w:space="0" w:color="DDD8CC"/>
-            </w:tcBorders>
-            <w:tcMar>
-              <w:top w:w="80" w:type="dxa"/>
-              <w:left w:w="120" w:type="dxa"/>
-              <w:bottom w:w="80" w:type="dxa"/>
-              <w:right w:w="120" w:type="dxa"/>
-            </w:tcMar>
           </w:tcPr>
           <w:p>
             <w:pPr>
               <w:spacing w:before="40" w:after="40"/>
               <w:rPr>
                 <w:rFonts w:ascii="Garamond" w:hAnsi="Garamond"/>
-              </w:rPr>
-            </w:pPr>
-            <w:r>
-              <w:rPr>
-                <w:rFonts w:ascii="Garamond" w:hAnsi="Garamond"/>
+                <w:color w:val="000000" w:themeColor="text1"/>
+              </w:rPr>
+            </w:pPr>
+            <w:r>
+              <w:rPr>
+                <w:rFonts w:ascii="Garamond" w:hAnsi="Garamond"/>
+                <w:color w:val="000000" w:themeColor="text1"/>
                 <w:sz w:val="20"/>
                 <w:szCs w:val="20"/>
               </w:rPr>
@@ -2278,29 +1813,19 @@
         <w:tc>
           <w:tcPr>
             <w:tcW w:w="1440" w:type="dxa"/>
-            <w:tcBorders>
-              <w:top w:val="single" w:sz="3" w:space="0" w:color="DDD8CC"/>
-              <w:left w:val="single" w:sz="3" w:space="0" w:color="DDD8CC"/>
-              <w:bottom w:val="single" w:sz="3" w:space="0" w:color="DDD8CC"/>
-              <w:right w:val="single" w:sz="3" w:space="0" w:color="DDD8CC"/>
-            </w:tcBorders>
-            <w:tcMar>
-              <w:top w:w="80" w:type="dxa"/>
-              <w:left w:w="120" w:type="dxa"/>
-              <w:bottom w:w="80" w:type="dxa"/>
-              <w:right w:w="120" w:type="dxa"/>
-            </w:tcMar>
           </w:tcPr>
           <w:p>
             <w:pPr>
               <w:spacing w:before="40" w:after="40"/>
               <w:rPr>
                 <w:rFonts w:ascii="Garamond" w:hAnsi="Garamond"/>
-              </w:rPr>
-            </w:pPr>
-            <w:r>
-              <w:rPr>
-                <w:rFonts w:ascii="Garamond" w:hAnsi="Garamond"/>
+                <w:color w:val="000000" w:themeColor="text1"/>
+              </w:rPr>
+            </w:pPr>
+            <w:r>
+              <w:rPr>
+                <w:rFonts w:ascii="Garamond" w:hAnsi="Garamond"/>
+                <w:color w:val="000000" w:themeColor="text1"/>
                 <w:sz w:val="20"/>
                 <w:szCs w:val="20"/>
               </w:rPr>
@@ -2311,29 +1836,19 @@
         <w:tc>
           <w:tcPr>
             <w:tcW w:w="1440" w:type="dxa"/>
-            <w:tcBorders>
-              <w:top w:val="single" w:sz="3" w:space="0" w:color="DDD8CC"/>
-              <w:left w:val="single" w:sz="3" w:space="0" w:color="DDD8CC"/>
-              <w:bottom w:val="single" w:sz="3" w:space="0" w:color="DDD8CC"/>
-              <w:right w:val="single" w:sz="3" w:space="0" w:color="DDD8CC"/>
-            </w:tcBorders>
-            <w:tcMar>
-              <w:top w:w="80" w:type="dxa"/>
-              <w:left w:w="120" w:type="dxa"/>
-              <w:bottom w:w="80" w:type="dxa"/>
-              <w:right w:w="120" w:type="dxa"/>
-            </w:tcMar>
           </w:tcPr>
           <w:p>
             <w:pPr>
               <w:spacing w:before="40" w:after="40"/>
               <w:rPr>
                 <w:rFonts w:ascii="Garamond" w:hAnsi="Garamond"/>
-              </w:rPr>
-            </w:pPr>
-            <w:r>
-              <w:rPr>
-                <w:rFonts w:ascii="Garamond" w:hAnsi="Garamond"/>
+                <w:color w:val="000000" w:themeColor="text1"/>
+              </w:rPr>
+            </w:pPr>
+            <w:r>
+              <w:rPr>
+                <w:rFonts w:ascii="Garamond" w:hAnsi="Garamond"/>
+                <w:color w:val="000000" w:themeColor="text1"/>
                 <w:sz w:val="20"/>
                 <w:szCs w:val="20"/>
               </w:rPr>
@@ -2344,29 +1859,19 @@
         <w:tc>
           <w:tcPr>
             <w:tcW w:w="1200" w:type="dxa"/>
-            <w:tcBorders>
-              <w:top w:val="single" w:sz="3" w:space="0" w:color="DDD8CC"/>
-              <w:left w:val="single" w:sz="3" w:space="0" w:color="DDD8CC"/>
-              <w:bottom w:val="single" w:sz="3" w:space="0" w:color="DDD8CC"/>
-              <w:right w:val="single" w:sz="3" w:space="0" w:color="DDD8CC"/>
-            </w:tcBorders>
-            <w:tcMar>
-              <w:top w:w="80" w:type="dxa"/>
-              <w:left w:w="120" w:type="dxa"/>
-              <w:bottom w:w="80" w:type="dxa"/>
-              <w:right w:w="120" w:type="dxa"/>
-            </w:tcMar>
           </w:tcPr>
           <w:p>
             <w:pPr>
               <w:spacing w:before="40" w:after="40"/>
               <w:rPr>
                 <w:rFonts w:ascii="Garamond" w:hAnsi="Garamond"/>
-              </w:rPr>
-            </w:pPr>
-            <w:r>
-              <w:rPr>
-                <w:rFonts w:ascii="Garamond" w:hAnsi="Garamond"/>
+                <w:color w:val="000000" w:themeColor="text1"/>
+              </w:rPr>
+            </w:pPr>
+            <w:r>
+              <w:rPr>
+                <w:rFonts w:ascii="Garamond" w:hAnsi="Garamond"/>
+                <w:color w:val="000000" w:themeColor="text1"/>
                 <w:sz w:val="20"/>
                 <w:szCs w:val="20"/>
               </w:rPr>
@@ -2379,29 +1884,19 @@
         <w:tc>
           <w:tcPr>
             <w:tcW w:w="2400" w:type="dxa"/>
-            <w:tcBorders>
-              <w:top w:val="single" w:sz="3" w:space="0" w:color="DDD8CC"/>
-              <w:left w:val="single" w:sz="3" w:space="0" w:color="DDD8CC"/>
-              <w:bottom w:val="single" w:sz="3" w:space="0" w:color="DDD8CC"/>
-              <w:right w:val="single" w:sz="3" w:space="0" w:color="DDD8CC"/>
-            </w:tcBorders>
-            <w:tcMar>
-              <w:top w:w="80" w:type="dxa"/>
-              <w:left w:w="120" w:type="dxa"/>
-              <w:bottom w:w="80" w:type="dxa"/>
-              <w:right w:w="120" w:type="dxa"/>
-            </w:tcMar>
           </w:tcPr>
           <w:p>
             <w:pPr>
               <w:spacing w:before="40" w:after="40"/>
               <w:rPr>
                 <w:rFonts w:ascii="Garamond" w:hAnsi="Garamond"/>
-              </w:rPr>
-            </w:pPr>
-            <w:r>
-              <w:rPr>
-                <w:rFonts w:ascii="Garamond" w:hAnsi="Garamond"/>
+                <w:color w:val="000000" w:themeColor="text1"/>
+              </w:rPr>
+            </w:pPr>
+            <w:r>
+              <w:rPr>
+                <w:rFonts w:ascii="Garamond" w:hAnsi="Garamond"/>
+                <w:color w:val="000000" w:themeColor="text1"/>
                 <w:sz w:val="20"/>
                 <w:szCs w:val="20"/>
               </w:rPr>
@@ -2412,29 +1907,19 @@
         <w:tc>
           <w:tcPr>
             <w:tcW w:w="1440" w:type="dxa"/>
-            <w:tcBorders>
-              <w:top w:val="single" w:sz="3" w:space="0" w:color="DDD8CC"/>
-              <w:left w:val="single" w:sz="3" w:space="0" w:color="DDD8CC"/>
-              <w:bottom w:val="single" w:sz="3" w:space="0" w:color="DDD8CC"/>
-              <w:right w:val="single" w:sz="3" w:space="0" w:color="DDD8CC"/>
-            </w:tcBorders>
-            <w:tcMar>
-              <w:top w:w="80" w:type="dxa"/>
-              <w:left w:w="120" w:type="dxa"/>
-              <w:bottom w:w="80" w:type="dxa"/>
-              <w:right w:w="120" w:type="dxa"/>
-            </w:tcMar>
           </w:tcPr>
           <w:p>
             <w:pPr>
               <w:spacing w:before="40" w:after="40"/>
               <w:rPr>
                 <w:rFonts w:ascii="Garamond" w:hAnsi="Garamond"/>
-              </w:rPr>
-            </w:pPr>
-            <w:r>
-              <w:rPr>
-                <w:rFonts w:ascii="Garamond" w:hAnsi="Garamond"/>
+                <w:color w:val="000000" w:themeColor="text1"/>
+              </w:rPr>
+            </w:pPr>
+            <w:r>
+              <w:rPr>
+                <w:rFonts w:ascii="Garamond" w:hAnsi="Garamond"/>
+                <w:color w:val="000000" w:themeColor="text1"/>
                 <w:sz w:val="20"/>
                 <w:szCs w:val="20"/>
               </w:rPr>
@@ -2445,29 +1930,19 @@
         <w:tc>
           <w:tcPr>
             <w:tcW w:w="1440" w:type="dxa"/>
-            <w:tcBorders>
-              <w:top w:val="single" w:sz="3" w:space="0" w:color="DDD8CC"/>
-              <w:left w:val="single" w:sz="3" w:space="0" w:color="DDD8CC"/>
-              <w:bottom w:val="single" w:sz="3" w:space="0" w:color="DDD8CC"/>
-              <w:right w:val="single" w:sz="3" w:space="0" w:color="DDD8CC"/>
-            </w:tcBorders>
-            <w:tcMar>
-              <w:top w:w="80" w:type="dxa"/>
-              <w:left w:w="120" w:type="dxa"/>
-              <w:bottom w:w="80" w:type="dxa"/>
-              <w:right w:w="120" w:type="dxa"/>
-            </w:tcMar>
           </w:tcPr>
           <w:p>
             <w:pPr>
               <w:spacing w:before="40" w:after="40"/>
               <w:rPr>
                 <w:rFonts w:ascii="Garamond" w:hAnsi="Garamond"/>
-              </w:rPr>
-            </w:pPr>
-            <w:r>
-              <w:rPr>
-                <w:rFonts w:ascii="Garamond" w:hAnsi="Garamond"/>
+                <w:color w:val="000000" w:themeColor="text1"/>
+              </w:rPr>
+            </w:pPr>
+            <w:r>
+              <w:rPr>
+                <w:rFonts w:ascii="Garamond" w:hAnsi="Garamond"/>
+                <w:color w:val="000000" w:themeColor="text1"/>
                 <w:sz w:val="20"/>
                 <w:szCs w:val="20"/>
               </w:rPr>
@@ -2478,29 +1953,19 @@
         <w:tc>
           <w:tcPr>
             <w:tcW w:w="1440" w:type="dxa"/>
-            <w:tcBorders>
-              <w:top w:val="single" w:sz="3" w:space="0" w:color="DDD8CC"/>
-              <w:left w:val="single" w:sz="3" w:space="0" w:color="DDD8CC"/>
-              <w:bottom w:val="single" w:sz="3" w:space="0" w:color="DDD8CC"/>
-              <w:right w:val="single" w:sz="3" w:space="0" w:color="DDD8CC"/>
-            </w:tcBorders>
-            <w:tcMar>
-              <w:top w:w="80" w:type="dxa"/>
-              <w:left w:w="120" w:type="dxa"/>
-              <w:bottom w:w="80" w:type="dxa"/>
-              <w:right w:w="120" w:type="dxa"/>
-            </w:tcMar>
           </w:tcPr>
           <w:p>
             <w:pPr>
               <w:spacing w:before="40" w:after="40"/>
               <w:rPr>
                 <w:rFonts w:ascii="Garamond" w:hAnsi="Garamond"/>
-              </w:rPr>
-            </w:pPr>
-            <w:r>
-              <w:rPr>
-                <w:rFonts w:ascii="Garamond" w:hAnsi="Garamond"/>
+                <w:color w:val="000000" w:themeColor="text1"/>
+              </w:rPr>
+            </w:pPr>
+            <w:r>
+              <w:rPr>
+                <w:rFonts w:ascii="Garamond" w:hAnsi="Garamond"/>
+                <w:color w:val="000000" w:themeColor="text1"/>
                 <w:sz w:val="20"/>
                 <w:szCs w:val="20"/>
               </w:rPr>
@@ -2511,24 +1976,13 @@
         <w:tc>
           <w:tcPr>
             <w:tcW w:w="1440" w:type="dxa"/>
-            <w:tcBorders>
-              <w:top w:val="single" w:sz="3" w:space="0" w:color="DDD8CC"/>
-              <w:left w:val="single" w:sz="3" w:space="0" w:color="DDD8CC"/>
-              <w:bottom w:val="single" w:sz="3" w:space="0" w:color="DDD8CC"/>
-              <w:right w:val="single" w:sz="3" w:space="0" w:color="DDD8CC"/>
-            </w:tcBorders>
-            <w:tcMar>
-              <w:top w:w="80" w:type="dxa"/>
-              <w:left w:w="120" w:type="dxa"/>
-              <w:bottom w:w="80" w:type="dxa"/>
-              <w:right w:w="120" w:type="dxa"/>
-            </w:tcMar>
           </w:tcPr>
           <w:p>
             <w:pPr>
               <w:spacing w:before="40" w:after="40"/>
               <w:rPr>
                 <w:rFonts w:ascii="Garamond" w:hAnsi="Garamond"/>
+                <w:color w:val="000000" w:themeColor="text1"/>
               </w:rPr>
             </w:pPr>
           </w:p>
@@ -2536,24 +1990,13 @@
         <w:tc>
           <w:tcPr>
             <w:tcW w:w="1200" w:type="dxa"/>
-            <w:tcBorders>
-              <w:top w:val="single" w:sz="3" w:space="0" w:color="DDD8CC"/>
-              <w:left w:val="single" w:sz="3" w:space="0" w:color="DDD8CC"/>
-              <w:bottom w:val="single" w:sz="3" w:space="0" w:color="DDD8CC"/>
-              <w:right w:val="single" w:sz="3" w:space="0" w:color="DDD8CC"/>
-            </w:tcBorders>
-            <w:tcMar>
-              <w:top w:w="80" w:type="dxa"/>
-              <w:left w:w="120" w:type="dxa"/>
-              <w:bottom w:w="80" w:type="dxa"/>
-              <w:right w:w="120" w:type="dxa"/>
-            </w:tcMar>
           </w:tcPr>
           <w:p>
             <w:pPr>
               <w:spacing w:before="40" w:after="40"/>
               <w:rPr>
                 <w:rFonts w:ascii="Garamond" w:hAnsi="Garamond"/>
+                <w:color w:val="000000" w:themeColor="text1"/>
               </w:rPr>
             </w:pPr>
           </w:p>
@@ -2563,29 +2006,19 @@
         <w:tc>
           <w:tcPr>
             <w:tcW w:w="2400" w:type="dxa"/>
-            <w:tcBorders>
-              <w:top w:val="single" w:sz="3" w:space="0" w:color="DDD8CC"/>
-              <w:left w:val="single" w:sz="3" w:space="0" w:color="DDD8CC"/>
-              <w:bottom w:val="single" w:sz="3" w:space="0" w:color="DDD8CC"/>
-              <w:right w:val="single" w:sz="3" w:space="0" w:color="DDD8CC"/>
-            </w:tcBorders>
-            <w:tcMar>
-              <w:top w:w="80" w:type="dxa"/>
-              <w:left w:w="120" w:type="dxa"/>
-              <w:bottom w:w="80" w:type="dxa"/>
-              <w:right w:w="120" w:type="dxa"/>
-            </w:tcMar>
           </w:tcPr>
           <w:p>
             <w:pPr>
               <w:spacing w:before="40" w:after="40"/>
               <w:rPr>
                 <w:rFonts w:ascii="Garamond" w:hAnsi="Garamond"/>
-              </w:rPr>
-            </w:pPr>
-            <w:r>
-              <w:rPr>
-                <w:rFonts w:ascii="Garamond" w:hAnsi="Garamond"/>
+                <w:color w:val="000000" w:themeColor="text1"/>
+              </w:rPr>
+            </w:pPr>
+            <w:r>
+              <w:rPr>
+                <w:rFonts w:ascii="Garamond" w:hAnsi="Garamond"/>
+                <w:color w:val="000000" w:themeColor="text1"/>
                 <w:sz w:val="20"/>
                 <w:szCs w:val="20"/>
               </w:rPr>
@@ -2596,29 +2029,19 @@
         <w:tc>
           <w:tcPr>
             <w:tcW w:w="1440" w:type="dxa"/>
-            <w:tcBorders>
-              <w:top w:val="single" w:sz="3" w:space="0" w:color="DDD8CC"/>
-              <w:left w:val="single" w:sz="3" w:space="0" w:color="DDD8CC"/>
-              <w:bottom w:val="single" w:sz="3" w:space="0" w:color="DDD8CC"/>
-              <w:right w:val="single" w:sz="3" w:space="0" w:color="DDD8CC"/>
-            </w:tcBorders>
-            <w:tcMar>
-              <w:top w:w="80" w:type="dxa"/>
-              <w:left w:w="120" w:type="dxa"/>
-              <w:bottom w:w="80" w:type="dxa"/>
-              <w:right w:w="120" w:type="dxa"/>
-            </w:tcMar>
           </w:tcPr>
           <w:p>
             <w:pPr>
               <w:spacing w:before="40" w:after="40"/>
               <w:rPr>
                 <w:rFonts w:ascii="Garamond" w:hAnsi="Garamond"/>
-              </w:rPr>
-            </w:pPr>
-            <w:r>
-              <w:rPr>
-                <w:rFonts w:ascii="Garamond" w:hAnsi="Garamond"/>
+                <w:color w:val="000000" w:themeColor="text1"/>
+              </w:rPr>
+            </w:pPr>
+            <w:r>
+              <w:rPr>
+                <w:rFonts w:ascii="Garamond" w:hAnsi="Garamond"/>
+                <w:color w:val="000000" w:themeColor="text1"/>
                 <w:sz w:val="20"/>
                 <w:szCs w:val="20"/>
               </w:rPr>
@@ -2629,29 +2052,19 @@
         <w:tc>
           <w:tcPr>
             <w:tcW w:w="1440" w:type="dxa"/>
-            <w:tcBorders>
-              <w:top w:val="single" w:sz="3" w:space="0" w:color="DDD8CC"/>
-              <w:left w:val="single" w:sz="3" w:space="0" w:color="DDD8CC"/>
-              <w:bottom w:val="single" w:sz="3" w:space="0" w:color="DDD8CC"/>
-              <w:right w:val="single" w:sz="3" w:space="0" w:color="DDD8CC"/>
-            </w:tcBorders>
-            <w:tcMar>
-              <w:top w:w="80" w:type="dxa"/>
-              <w:left w:w="120" w:type="dxa"/>
-              <w:bottom w:w="80" w:type="dxa"/>
-              <w:right w:w="120" w:type="dxa"/>
-            </w:tcMar>
           </w:tcPr>
           <w:p>
             <w:pPr>
               <w:spacing w:before="40" w:after="40"/>
               <w:rPr>
                 <w:rFonts w:ascii="Garamond" w:hAnsi="Garamond"/>
-              </w:rPr>
-            </w:pPr>
-            <w:r>
-              <w:rPr>
-                <w:rFonts w:ascii="Garamond" w:hAnsi="Garamond"/>
+                <w:color w:val="000000" w:themeColor="text1"/>
+              </w:rPr>
+            </w:pPr>
+            <w:r>
+              <w:rPr>
+                <w:rFonts w:ascii="Garamond" w:hAnsi="Garamond"/>
+                <w:color w:val="000000" w:themeColor="text1"/>
                 <w:sz w:val="20"/>
                 <w:szCs w:val="20"/>
               </w:rPr>
@@ -2662,24 +2075,13 @@
         <w:tc>
           <w:tcPr>
             <w:tcW w:w="1440" w:type="dxa"/>
-            <w:tcBorders>
-              <w:top w:val="single" w:sz="3" w:space="0" w:color="DDD8CC"/>
-              <w:left w:val="single" w:sz="3" w:space="0" w:color="DDD8CC"/>
-              <w:bottom w:val="single" w:sz="3" w:space="0" w:color="DDD8CC"/>
-              <w:right w:val="single" w:sz="3" w:space="0" w:color="DDD8CC"/>
-            </w:tcBorders>
-            <w:tcMar>
-              <w:top w:w="80" w:type="dxa"/>
-              <w:left w:w="120" w:type="dxa"/>
-              <w:bottom w:w="80" w:type="dxa"/>
-              <w:right w:w="120" w:type="dxa"/>
-            </w:tcMar>
           </w:tcPr>
           <w:p>
             <w:pPr>
               <w:spacing w:before="40" w:after="40"/>
               <w:rPr>
                 <w:rFonts w:ascii="Garamond" w:hAnsi="Garamond"/>
+                <w:color w:val="000000" w:themeColor="text1"/>
               </w:rPr>
             </w:pPr>
           </w:p>
@@ -2687,24 +2089,13 @@
         <w:tc>
           <w:tcPr>
             <w:tcW w:w="1440" w:type="dxa"/>
-            <w:tcBorders>
-              <w:top w:val="single" w:sz="3" w:space="0" w:color="DDD8CC"/>
-              <w:left w:val="single" w:sz="3" w:space="0" w:color="DDD8CC"/>
-              <w:bottom w:val="single" w:sz="3" w:space="0" w:color="DDD8CC"/>
-              <w:right w:val="single" w:sz="3" w:space="0" w:color="DDD8CC"/>
-            </w:tcBorders>
-            <w:tcMar>
-              <w:top w:w="80" w:type="dxa"/>
-              <w:left w:w="120" w:type="dxa"/>
-              <w:bottom w:w="80" w:type="dxa"/>
-              <w:right w:w="120" w:type="dxa"/>
-            </w:tcMar>
           </w:tcPr>
           <w:p>
             <w:pPr>
               <w:spacing w:before="40" w:after="40"/>
               <w:rPr>
                 <w:rFonts w:ascii="Garamond" w:hAnsi="Garamond"/>
+                <w:color w:val="000000" w:themeColor="text1"/>
               </w:rPr>
             </w:pPr>
           </w:p>
@@ -2712,24 +2103,13 @@
         <w:tc>
           <w:tcPr>
             <w:tcW w:w="1200" w:type="dxa"/>
-            <w:tcBorders>
-              <w:top w:val="single" w:sz="3" w:space="0" w:color="DDD8CC"/>
-              <w:left w:val="single" w:sz="3" w:space="0" w:color="DDD8CC"/>
-              <w:bottom w:val="single" w:sz="3" w:space="0" w:color="DDD8CC"/>
-              <w:right w:val="single" w:sz="3" w:space="0" w:color="DDD8CC"/>
-            </w:tcBorders>
-            <w:tcMar>
-              <w:top w:w="80" w:type="dxa"/>
-              <w:left w:w="120" w:type="dxa"/>
-              <w:bottom w:w="80" w:type="dxa"/>
-              <w:right w:w="120" w:type="dxa"/>
-            </w:tcMar>
           </w:tcPr>
           <w:p>
             <w:pPr>
               <w:spacing w:before="40" w:after="40"/>
               <w:rPr>
                 <w:rFonts w:ascii="Garamond" w:hAnsi="Garamond"/>
+                <w:color w:val="000000" w:themeColor="text1"/>
               </w:rPr>
             </w:pPr>
           </w:p>
@@ -2741,6 +2121,7 @@
         <w:spacing w:before="240" w:after="240"/>
         <w:rPr>
           <w:rFonts w:ascii="Garamond" w:hAnsi="Garamond"/>
+          <w:color w:val="000000" w:themeColor="text1"/>
         </w:rPr>
       </w:pPr>
     </w:p>
@@ -2749,6 +2130,7 @@
         <w:spacing w:before="160" w:after="80"/>
         <w:rPr>
           <w:rFonts w:ascii="Garamond" w:hAnsi="Garamond"/>
+          <w:color w:val="000000" w:themeColor="text1"/>
         </w:rPr>
       </w:pPr>
       <w:r>
@@ -2756,7 +2138,7 @@
           <w:rFonts w:ascii="Garamond" w:hAnsi="Garamond"/>
           <w:b/>
           <w:bCs/>
-          <w:color w:val="154734"/>
+          <w:color w:val="000000" w:themeColor="text1"/>
         </w:rPr>
         <w:t>(a)  Identify the test statistic</w:t>
       </w:r>
@@ -2766,11 +2148,13 @@
         <w:spacing w:before="60" w:after="100"/>
         <w:rPr>
           <w:rFonts w:ascii="Garamond" w:hAnsi="Garamond"/>
-        </w:rPr>
-      </w:pPr>
-      <w:r>
-        <w:rPr>
-          <w:rFonts w:ascii="Garamond" w:hAnsi="Garamond"/>
+          <w:color w:val="000000" w:themeColor="text1"/>
+        </w:rPr>
+      </w:pPr>
+      <w:r>
+        <w:rPr>
+          <w:rFonts w:ascii="Garamond" w:hAnsi="Garamond"/>
+          <w:color w:val="000000" w:themeColor="text1"/>
         </w:rPr>
         <w:t xml:space="preserve">The test statistic for a one-way ANOVA is the </w:t>
       </w:r>
@@ -2779,12 +2163,14 @@
           <w:rFonts w:ascii="Garamond" w:hAnsi="Garamond"/>
           <w:b/>
           <w:bCs/>
+          <w:color w:val="000000" w:themeColor="text1"/>
         </w:rPr>
         <w:t>F-statistic</w:t>
       </w:r>
       <w:r>
         <w:rPr>
           <w:rFonts w:ascii="Garamond" w:hAnsi="Garamond"/>
+          <w:color w:val="000000" w:themeColor="text1"/>
         </w:rPr>
         <w:t>. From the table:</w:t>
       </w:r>
@@ -2794,6 +2180,7 @@
         <w:spacing w:before="80" w:after="80"/>
         <w:rPr>
           <w:rFonts w:ascii="Garamond" w:hAnsi="Garamond"/>
+          <w:color w:val="000000" w:themeColor="text1"/>
         </w:rPr>
       </w:pPr>
     </w:p>
@@ -2802,18 +2189,20 @@
         <w:spacing w:before="80" w:after="120"/>
         <w:rPr>
           <w:rFonts w:ascii="Garamond" w:hAnsi="Garamond"/>
-        </w:rPr>
-      </w:pPr>
-      <w:r>
-        <w:rPr>
-          <w:rFonts w:ascii="Garamond" w:hAnsi="Garamond"/>
+          <w:color w:val="000000" w:themeColor="text1"/>
+        </w:rPr>
+      </w:pPr>
+      <w:r>
+        <w:rPr>
+          <w:rFonts w:ascii="Garamond" w:hAnsi="Garamond"/>
+          <w:color w:val="000000" w:themeColor="text1"/>
         </w:rPr>
         <w:t xml:space="preserve">F = </w:t>
       </w:r>
       <w:r>
         <w:rPr>
           <w:rFonts w:ascii="Garamond" w:hAnsi="Garamond"/>
-          <w:color w:val="AAAAAA"/>
+          <w:color w:val="000000" w:themeColor="text1"/>
           <w:u w:val="single"/>
         </w:rPr>
         <w:t>          </w:t>
@@ -2821,13 +2210,14 @@
       <w:r>
         <w:rPr>
           <w:rFonts w:ascii="Garamond" w:hAnsi="Garamond"/>
+          <w:color w:val="000000" w:themeColor="text1"/>
         </w:rPr>
         <w:t xml:space="preserve">     This means between-group variability is approximately </w:t>
       </w:r>
       <w:r>
         <w:rPr>
           <w:rFonts w:ascii="Garamond" w:hAnsi="Garamond"/>
-          <w:color w:val="AAAAAA"/>
+          <w:color w:val="000000" w:themeColor="text1"/>
           <w:u w:val="single"/>
         </w:rPr>
         <w:t>          </w:t>
@@ -2835,6 +2225,7 @@
       <w:r>
         <w:rPr>
           <w:rFonts w:ascii="Garamond" w:hAnsi="Garamond"/>
+          <w:color w:val="000000" w:themeColor="text1"/>
         </w:rPr>
         <w:t xml:space="preserve"> larger than within-group variability.</w:t>
       </w:r>
@@ -2844,6 +2235,7 @@
         <w:spacing w:before="160" w:after="160"/>
         <w:rPr>
           <w:rFonts w:ascii="Garamond" w:hAnsi="Garamond"/>
+          <w:color w:val="000000" w:themeColor="text1"/>
         </w:rPr>
       </w:pPr>
     </w:p>
@@ -2852,6 +2244,7 @@
         <w:spacing w:before="160" w:after="80"/>
         <w:rPr>
           <w:rFonts w:ascii="Garamond" w:hAnsi="Garamond"/>
+          <w:color w:val="000000" w:themeColor="text1"/>
         </w:rPr>
       </w:pPr>
       <w:r>
@@ -2859,7 +2252,7 @@
           <w:rFonts w:ascii="Garamond" w:hAnsi="Garamond"/>
           <w:b/>
           <w:bCs/>
-          <w:color w:val="154734"/>
+          <w:color w:val="000000" w:themeColor="text1"/>
         </w:rPr>
         <w:t>(b)  State and interpret the p-value</w:t>
       </w:r>
@@ -2869,18 +2262,20 @@
         <w:spacing w:before="80" w:after="120"/>
         <w:rPr>
           <w:rFonts w:ascii="Garamond" w:hAnsi="Garamond"/>
-        </w:rPr>
-      </w:pPr>
-      <w:r>
-        <w:rPr>
-          <w:rFonts w:ascii="Garamond" w:hAnsi="Garamond"/>
+          <w:color w:val="000000" w:themeColor="text1"/>
+        </w:rPr>
+      </w:pPr>
+      <w:r>
+        <w:rPr>
+          <w:rFonts w:ascii="Garamond" w:hAnsi="Garamond"/>
+          <w:color w:val="000000" w:themeColor="text1"/>
         </w:rPr>
         <w:t xml:space="preserve">p-value = </w:t>
       </w:r>
       <w:r>
         <w:rPr>
           <w:rFonts w:ascii="Garamond" w:hAnsi="Garamond"/>
-          <w:color w:val="AAAAAA"/>
+          <w:color w:val="000000" w:themeColor="text1"/>
           <w:u w:val="single"/>
         </w:rPr>
         <w:t>          </w:t>
@@ -2891,6 +2286,7 @@
         <w:spacing w:before="200" w:after="200"/>
         <w:rPr>
           <w:rFonts w:ascii="Garamond" w:hAnsi="Garamond"/>
+          <w:color w:val="000000" w:themeColor="text1"/>
         </w:rPr>
       </w:pPr>
     </w:p>
@@ -2899,6 +2295,7 @@
         <w:spacing w:before="200" w:after="200"/>
         <w:rPr>
           <w:rFonts w:ascii="Garamond" w:hAnsi="Garamond"/>
+          <w:color w:val="000000" w:themeColor="text1"/>
         </w:rPr>
       </w:pPr>
     </w:p>
@@ -2907,6 +2304,7 @@
         <w:spacing w:before="200" w:after="200"/>
         <w:rPr>
           <w:rFonts w:ascii="Garamond" w:hAnsi="Garamond"/>
+          <w:color w:val="000000" w:themeColor="text1"/>
         </w:rPr>
       </w:pPr>
     </w:p>
@@ -2915,6 +2313,7 @@
         <w:spacing w:before="200" w:after="200"/>
         <w:rPr>
           <w:rFonts w:ascii="Garamond" w:hAnsi="Garamond"/>
+          <w:color w:val="000000" w:themeColor="text1"/>
         </w:rPr>
       </w:pPr>
     </w:p>
@@ -2923,6 +2322,7 @@
         <w:spacing w:before="200" w:after="200"/>
         <w:rPr>
           <w:rFonts w:ascii="Garamond" w:hAnsi="Garamond"/>
+          <w:color w:val="000000" w:themeColor="text1"/>
         </w:rPr>
       </w:pPr>
     </w:p>
@@ -2931,6 +2331,7 @@
         <w:spacing w:before="160" w:after="80"/>
         <w:rPr>
           <w:rFonts w:ascii="Garamond" w:hAnsi="Garamond"/>
+          <w:color w:val="000000" w:themeColor="text1"/>
         </w:rPr>
       </w:pPr>
       <w:r>
@@ -2938,19 +2339,21 @@
           <w:rFonts w:ascii="Garamond" w:hAnsi="Garamond"/>
           <w:b/>
           <w:bCs/>
-          <w:color w:val="154734"/>
+          <w:color w:val="000000" w:themeColor="text1"/>
         </w:rPr>
         <w:t>(c)  Write a conclusion in context</w:t>
       </w:r>
       <w:r>
         <w:rPr>
           <w:rFonts w:ascii="Garamond" w:hAnsi="Garamond"/>
+          <w:color w:val="000000" w:themeColor="text1"/>
         </w:rPr>
         <w:t xml:space="preserve">. </w:t>
       </w:r>
       <w:r>
         <w:rPr>
           <w:rFonts w:ascii="Garamond" w:hAnsi="Garamond"/>
+          <w:color w:val="000000" w:themeColor="text1"/>
         </w:rPr>
         <w:t xml:space="preserve">Write a conclusion that addresses the research question. </w:t>
       </w:r>
@@ -2960,6 +2363,7 @@
         <w:spacing w:before="120" w:after="120"/>
         <w:rPr>
           <w:rFonts w:ascii="Garamond" w:hAnsi="Garamond"/>
+          <w:color w:val="000000" w:themeColor="text1"/>
         </w:rPr>
       </w:pPr>
     </w:p>
@@ -3134,6 +2538,7 @@
       <w:spacing w:after="120"/>
       <w:rPr>
         <w:rFonts w:ascii="Garamond" w:hAnsi="Garamond"/>
+        <w:color w:val="000000" w:themeColor="text1"/>
       </w:rPr>
     </w:pPr>
     <w:r>
@@ -3141,7 +2546,7 @@
         <w:rFonts w:ascii="Garamond" w:hAnsi="Garamond"/>
         <w:b/>
         <w:bCs/>
-        <w:color w:val="888888"/>
+        <w:color w:val="000000" w:themeColor="text1"/>
         <w:sz w:val="18"/>
         <w:szCs w:val="18"/>
       </w:rPr>
@@ -3153,7 +2558,7 @@
         <w:rFonts w:ascii="Garamond" w:hAnsi="Garamond"/>
         <w:b/>
         <w:bCs/>
-        <w:color w:val="888888"/>
+        <w:color w:val="000000" w:themeColor="text1"/>
         <w:sz w:val="18"/>
         <w:szCs w:val="18"/>
       </w:rPr>
@@ -3165,22 +2570,11 @@
         <w:rFonts w:ascii="Garamond" w:hAnsi="Garamond"/>
         <w:b/>
         <w:bCs/>
-        <w:color w:val="888888"/>
+        <w:color w:val="000000" w:themeColor="text1"/>
         <w:sz w:val="18"/>
         <w:szCs w:val="18"/>
       </w:rPr>
-      <w:t xml:space="preserve">  </w:t>
-    </w:r>
-    <w:r>
-      <w:rPr>
-        <w:rFonts w:ascii="Garamond" w:hAnsi="Garamond"/>
-        <w:b/>
-        <w:bCs/>
-        <w:color w:val="154734"/>
-        <w:sz w:val="18"/>
-        <w:szCs w:val="18"/>
-      </w:rPr>
-      <w:t xml:space="preserve">One-Way </w:t>
+      <w:t xml:space="preserve">  One-Way </w:t>
     </w:r>
     <w:proofErr w:type="gramStart"/>
     <w:r>
@@ -3188,7 +2582,7 @@
         <w:rFonts w:ascii="Garamond" w:hAnsi="Garamond"/>
         <w:b/>
         <w:bCs/>
-        <w:color w:val="154734"/>
+        <w:color w:val="000000" w:themeColor="text1"/>
         <w:sz w:val="18"/>
         <w:szCs w:val="18"/>
       </w:rPr>
@@ -3200,7 +2594,7 @@
         <w:rFonts w:ascii="Garamond" w:hAnsi="Garamond"/>
         <w:b/>
         <w:bCs/>
-        <w:color w:val="154734"/>
+        <w:color w:val="000000" w:themeColor="text1"/>
         <w:sz w:val="18"/>
         <w:szCs w:val="18"/>
       </w:rPr>
@@ -3212,7 +2606,7 @@
         <w:rFonts w:ascii="Garamond" w:hAnsi="Garamond"/>
         <w:b/>
         <w:bCs/>
-        <w:color w:val="154734"/>
+        <w:color w:val="000000" w:themeColor="text1"/>
         <w:sz w:val="18"/>
         <w:szCs w:val="18"/>
       </w:rPr>
@@ -3221,6 +2615,7 @@
     <w:r>
       <w:rPr>
         <w:rFonts w:ascii="Garamond" w:hAnsi="Garamond"/>
+        <w:color w:val="000000" w:themeColor="text1"/>
       </w:rPr>
       <w:tab/>
     </w:r>
@@ -3230,7 +2625,7 @@
         <w:rFonts w:ascii="Garamond" w:hAnsi="Garamond"/>
         <w:b/>
         <w:bCs/>
-        <w:color w:val="154734"/>
+        <w:color w:val="000000" w:themeColor="text1"/>
         <w:sz w:val="18"/>
         <w:szCs w:val="18"/>
       </w:rPr>
@@ -4145,6 +3540,22 @@
     <w:uiPriority w:val="99"/>
     <w:rsid w:val="00440866"/>
   </w:style>
+  <w:style w:type="table" w:styleId="TableGrid">
+    <w:name w:val="Table Grid"/>
+    <w:basedOn w:val="TableNormal"/>
+    <w:uiPriority w:val="39"/>
+    <w:rsid w:val="00781B64"/>
+    <w:tblPr>
+      <w:tblBorders>
+        <w:top w:val="single" w:sz="4" w:space="0" w:color="auto"/>
+        <w:left w:val="single" w:sz="4" w:space="0" w:color="auto"/>
+        <w:bottom w:val="single" w:sz="4" w:space="0" w:color="auto"/>
+        <w:right w:val="single" w:sz="4" w:space="0" w:color="auto"/>
+        <w:insideH w:val="single" w:sz="4" w:space="0" w:color="auto"/>
+        <w:insideV w:val="single" w:sz="4" w:space="0" w:color="auto"/>
+      </w:tblBorders>
+    </w:tblPr>
+  </w:style>
 </w:styles>
 </file>
 

</xml_diff>

<commit_message>
Add student and teacher documents for OVA Part A and B
- Created new student document for OVA Part A: ~$ova_part_a_student_08.docx
- Created new student document for OVA Part B: ~$ova_part_b_student_08.docx
- Created new teacher document for OVA Part B: ~$ova_part_b_teacher.docx
</commit_message>
<xml_diff>
--- a/classroom_activities/anova_part_a_student.docx
+++ b/classroom_activities/anova_part_a_student.docx
@@ -471,6 +471,15 @@
     </w:p>
     <w:p>
       <w:pPr>
+        <w:spacing w:before="200" w:after="200"/>
+        <w:rPr>
+          <w:rFonts w:ascii="Garamond" w:hAnsi="Garamond"/>
+          <w:color w:val="000000" w:themeColor="text1"/>
+        </w:rPr>
+      </w:pPr>
+    </w:p>
+    <w:p>
+      <w:pPr>
         <w:pBdr>
           <w:bottom w:val="single" w:sz="4" w:space="0" w:color="DDD8CC"/>
         </w:pBdr>
@@ -607,16 +616,18 @@
               <w:rPr>
                 <w:rFonts w:ascii="Garamond" w:hAnsi="Garamond"/>
                 <w:color w:val="000000" w:themeColor="text1"/>
-              </w:rPr>
-            </w:pPr>
-            <w:r>
-              <w:rPr>
-                <w:rFonts w:ascii="Garamond" w:hAnsi="Garamond"/>
-                <w:color w:val="000000" w:themeColor="text1"/>
                 <w:u w:val="single"/>
               </w:rPr>
-              <w:t>                      </w:t>
-            </w:r>
+            </w:pPr>
+          </w:p>
+          <w:p>
+            <w:pPr>
+              <w:spacing w:before="60" w:after="100"/>
+              <w:rPr>
+                <w:rFonts w:ascii="Garamond" w:hAnsi="Garamond"/>
+                <w:color w:val="000000" w:themeColor="text1"/>
+              </w:rPr>
+            </w:pPr>
           </w:p>
         </w:tc>
         <w:tc>
@@ -631,14 +642,6 @@
                 <w:color w:val="000000" w:themeColor="text1"/>
               </w:rPr>
             </w:pPr>
-            <w:r>
-              <w:rPr>
-                <w:rFonts w:ascii="Garamond" w:hAnsi="Garamond"/>
-                <w:color w:val="000000" w:themeColor="text1"/>
-                <w:u w:val="single"/>
-              </w:rPr>
-              <w:t>                                                  </w:t>
-            </w:r>
           </w:p>
         </w:tc>
       </w:tr>
@@ -653,16 +656,19 @@
               <w:rPr>
                 <w:rFonts w:ascii="Garamond" w:hAnsi="Garamond"/>
                 <w:color w:val="000000" w:themeColor="text1"/>
-              </w:rPr>
-            </w:pPr>
-            <w:r>
-              <w:rPr>
-                <w:rFonts w:ascii="Garamond" w:hAnsi="Garamond"/>
-                <w:color w:val="000000" w:themeColor="text1"/>
                 <w:u w:val="single"/>
               </w:rPr>
-              <w:t>                      </w:t>
-            </w:r>
+            </w:pPr>
+          </w:p>
+          <w:p>
+            <w:pPr>
+              <w:spacing w:before="60" w:after="100"/>
+              <w:rPr>
+                <w:rFonts w:ascii="Garamond" w:hAnsi="Garamond"/>
+                <w:color w:val="000000" w:themeColor="text1"/>
+                <w:u w:val="single"/>
+              </w:rPr>
+            </w:pPr>
           </w:p>
         </w:tc>
         <w:tc>
@@ -677,27 +683,10 @@
                 <w:color w:val="000000" w:themeColor="text1"/>
               </w:rPr>
             </w:pPr>
-            <w:r>
-              <w:rPr>
-                <w:rFonts w:ascii="Garamond" w:hAnsi="Garamond"/>
-                <w:color w:val="000000" w:themeColor="text1"/>
-                <w:u w:val="single"/>
-              </w:rPr>
-              <w:t>                                                  </w:t>
-            </w:r>
           </w:p>
         </w:tc>
       </w:tr>
     </w:tbl>
-    <w:p>
-      <w:pPr>
-        <w:spacing w:before="240" w:after="240"/>
-        <w:rPr>
-          <w:rFonts w:ascii="Garamond" w:hAnsi="Garamond"/>
-          <w:color w:val="000000" w:themeColor="text1"/>
-        </w:rPr>
-      </w:pPr>
-    </w:p>
     <w:p>
       <w:pPr>
         <w:spacing w:before="160" w:after="80"/>
@@ -810,14 +799,15 @@
                 <w:color w:val="000000" w:themeColor="text1"/>
               </w:rPr>
             </w:pPr>
-            <w:r>
-              <w:rPr>
-                <w:rFonts w:ascii="Garamond" w:hAnsi="Garamond"/>
-                <w:color w:val="000000" w:themeColor="text1"/>
-                <w:u w:val="single"/>
-              </w:rPr>
-              <w:t>                                                  </w:t>
-            </w:r>
+          </w:p>
+          <w:p>
+            <w:pPr>
+              <w:spacing w:before="60" w:after="100"/>
+              <w:rPr>
+                <w:rFonts w:ascii="Garamond" w:hAnsi="Garamond"/>
+                <w:color w:val="000000" w:themeColor="text1"/>
+              </w:rPr>
+            </w:pPr>
           </w:p>
         </w:tc>
       </w:tr>
@@ -855,38 +845,22 @@
               <w:rPr>
                 <w:rFonts w:ascii="Garamond" w:hAnsi="Garamond"/>
                 <w:color w:val="000000" w:themeColor="text1"/>
-              </w:rPr>
-            </w:pPr>
-            <w:r>
-              <w:rPr>
-                <w:rFonts w:ascii="Garamond" w:hAnsi="Garamond"/>
-                <w:color w:val="000000" w:themeColor="text1"/>
                 <w:u w:val="single"/>
               </w:rPr>
-              <w:t>                                                  </w:t>
-            </w:r>
+            </w:pPr>
+          </w:p>
+          <w:p>
+            <w:pPr>
+              <w:spacing w:before="60" w:after="100"/>
+              <w:rPr>
+                <w:rFonts w:ascii="Garamond" w:hAnsi="Garamond"/>
+                <w:color w:val="000000" w:themeColor="text1"/>
+              </w:rPr>
+            </w:pPr>
           </w:p>
         </w:tc>
       </w:tr>
     </w:tbl>
-    <w:p>
-      <w:pPr>
-        <w:spacing w:before="240" w:after="240"/>
-        <w:rPr>
-          <w:rFonts w:ascii="Garamond" w:hAnsi="Garamond"/>
-          <w:color w:val="000000" w:themeColor="text1"/>
-        </w:rPr>
-      </w:pPr>
-    </w:p>
-    <w:p>
-      <w:pPr>
-        <w:spacing w:before="240" w:after="240"/>
-        <w:rPr>
-          <w:rFonts w:ascii="Garamond" w:hAnsi="Garamond"/>
-          <w:color w:val="000000" w:themeColor="text1"/>
-        </w:rPr>
-      </w:pPr>
-    </w:p>
     <w:p>
       <w:pPr>
         <w:spacing w:before="240" w:after="240"/>
@@ -2280,24 +2254,6 @@
         </w:rPr>
         <w:t>          </w:t>
       </w:r>
-    </w:p>
-    <w:p>
-      <w:pPr>
-        <w:spacing w:before="200" w:after="200"/>
-        <w:rPr>
-          <w:rFonts w:ascii="Garamond" w:hAnsi="Garamond"/>
-          <w:color w:val="000000" w:themeColor="text1"/>
-        </w:rPr>
-      </w:pPr>
-    </w:p>
-    <w:p>
-      <w:pPr>
-        <w:spacing w:before="200" w:after="200"/>
-        <w:rPr>
-          <w:rFonts w:ascii="Garamond" w:hAnsi="Garamond"/>
-          <w:color w:val="000000" w:themeColor="text1"/>
-        </w:rPr>
-      </w:pPr>
     </w:p>
     <w:p>
       <w:pPr>

</xml_diff>